<commit_message>
Show ending quadrant in study reports
Co-authored-by: drhycheung <115221187+drhycheung@users.noreply.github.com>
</commit_message>
<xml_diff>
--- a/examples/report-ai-hiring-boom_ethics.docx
+++ b/examples/report-ai-hiring-boom_ethics.docx
@@ -31,7 +31,7 @@
         <w:pStyle w:val="Normal"/>
       </w:pPr>
       <w:r>
-        <w:t xml:space="preserve">导出于 2026/10/16 17:12:35</w:t>
+        <w:t xml:space="preserve">导出于 2026/10/16 09:12:35</w:t>
       </w:r>
     </w:p>
     <w:p>
@@ -48,6 +48,14 @@
       </w:pPr>
       <w:r>
         <w:t xml:space="preserve">类型：失败</w:t>
+      </w:r>
+    </w:p>
+    <w:p>
+      <w:pPr>
+        <w:pStyle w:val="Normal"/>
+      </w:pPr>
+      <w:r>
+        <w:t xml:space="preserve">结局象限：高风险 × 强价值 · 😭 繁荣后崩溃</w:t>
       </w:r>
     </w:p>
     <w:p>
@@ -61,7 +69,7 @@
     <w:tbl>
       <w:tblPr>
         <w:tblStyle w:val="TableGrid"/>
-        <w:tblW w:w="5000" w:type="pct"/>
+        <w:tblW w:w="9638" w:type="dxa"/>
       </w:tblPr>
       <w:tr>
         <w:tc>
@@ -187,7 +195,7 @@
     <w:tbl>
       <w:tblPr>
         <w:tblStyle w:val="TableGrid"/>
-        <w:tblW w:w="5000" w:type="pct"/>
+        <w:tblW w:w="9638" w:type="dxa"/>
       </w:tblPr>
       <w:tr>
         <w:tc>
@@ -652,6 +660,14 @@
       </w:pPr>
       <w:r>
         <w:t xml:space="preserve">你的选择：接下这笔试点合同，正式成立团队</w:t>
+      </w:r>
+    </w:p>
+    <w:p>
+      <w:pPr>
+        <w:pStyle w:val="Normal"/>
+      </w:pPr>
+      <w:r>
+        <w:t xml:space="preserve">为什么：这一步把试点机会变成正式经营，让团队进入后续的产品与增长决策；它本身不改变任何评分维度，具体影响从下一步的选择开始计入。</w:t>
       </w:r>
     </w:p>
     <w:p>
@@ -681,7 +697,7 @@
     <w:tbl>
       <w:tblPr>
         <w:tblStyle w:val="TableGrid"/>
-        <w:tblW w:w="5000" w:type="pct"/>
+        <w:tblW w:w="9638" w:type="dxa"/>
       </w:tblPr>
       <w:tr>
         <w:tc>
@@ -850,7 +866,7 @@
     <w:tbl>
       <w:tblPr>
         <w:tblStyle w:val="TableGrid"/>
-        <w:tblW w:w="5000" w:type="pct"/>
+        <w:tblW w:w="9638" w:type="dxa"/>
       </w:tblPr>
       <w:tr>
         <w:tc>
@@ -1060,7 +1076,7 @@
     <w:tbl>
       <w:tblPr>
         <w:tblStyle w:val="TableGrid"/>
-        <w:tblW w:w="5000" w:type="pct"/>
+        <w:tblW w:w="9638" w:type="dxa"/>
       </w:tblPr>
       <w:tr>
         <w:tc>
@@ -1270,7 +1286,7 @@
     <w:tbl>
       <w:tblPr>
         <w:tblStyle w:val="TableGrid"/>
-        <w:tblW w:w="5000" w:type="pct"/>
+        <w:tblW w:w="9638" w:type="dxa"/>
       </w:tblPr>
       <w:tr>
         <w:tc>
@@ -1398,7 +1414,7 @@
     <w:tbl>
       <w:tblPr>
         <w:tblStyle w:val="TableGrid"/>
-        <w:tblW w:w="5000" w:type="pct"/>
+        <w:tblW w:w="9638" w:type="dxa"/>
       </w:tblPr>
       <w:tr>
         <w:tc>
@@ -1526,7 +1542,7 @@
     <w:tbl>
       <w:tblPr>
         <w:tblStyle w:val="TableGrid"/>
-        <w:tblW w:w="5000" w:type="pct"/>
+        <w:tblW w:w="9638" w:type="dxa"/>
       </w:tblPr>
       <w:tr>
         <w:tc>
@@ -1736,7 +1752,7 @@
     <w:tbl>
       <w:tblPr>
         <w:tblStyle w:val="TableGrid"/>
-        <w:tblW w:w="5000" w:type="pct"/>
+        <w:tblW w:w="9638" w:type="dxa"/>
       </w:tblPr>
       <w:tr>
         <w:tc>
@@ -1905,7 +1921,7 @@
     <w:tbl>
       <w:tblPr>
         <w:tblStyle w:val="TableGrid"/>
-        <w:tblW w:w="5000" w:type="pct"/>
+        <w:tblW w:w="9638" w:type="dxa"/>
       </w:tblPr>
       <w:tr>
         <w:tc>
@@ -2074,7 +2090,7 @@
     <w:tbl>
       <w:tblPr>
         <w:tblStyle w:val="TableGrid"/>
-        <w:tblW w:w="5000" w:type="pct"/>
+        <w:tblW w:w="9638" w:type="dxa"/>
       </w:tblPr>
       <w:tr>
         <w:tc>
@@ -2325,7 +2341,7 @@
     <w:tbl>
       <w:tblPr>
         <w:tblStyle w:val="TableGrid"/>
-        <w:tblW w:w="5000" w:type="pct"/>
+        <w:tblW w:w="9638" w:type="dxa"/>
       </w:tblPr>
       <w:tr>
         <w:tc>
@@ -2576,7 +2592,7 @@
     <w:tbl>
       <w:tblPr>
         <w:tblStyle w:val="TableGrid"/>
-        <w:tblW w:w="5000" w:type="pct"/>
+        <w:tblW w:w="9638" w:type="dxa"/>
       </w:tblPr>
       <w:tr>
         <w:tc>
@@ -2827,7 +2843,7 @@
     <w:tbl>
       <w:tblPr>
         <w:tblStyle w:val="TableGrid"/>
-        <w:tblW w:w="5000" w:type="pct"/>
+        <w:tblW w:w="9638" w:type="dxa"/>
       </w:tblPr>
       <w:tr>
         <w:tc>
@@ -2996,7 +3012,7 @@
     <w:tbl>
       <w:tblPr>
         <w:tblStyle w:val="TableGrid"/>
-        <w:tblW w:w="5000" w:type="pct"/>
+        <w:tblW w:w="9638" w:type="dxa"/>
       </w:tblPr>
       <w:tr>
         <w:tc>
@@ -3237,7 +3253,7 @@
     <w:tbl>
       <w:tblPr>
         <w:tblStyle w:val="TableGrid"/>
-        <w:tblW w:w="5000" w:type="pct"/>
+        <w:tblW w:w="9638" w:type="dxa"/>
       </w:tblPr>
       <w:tr>
         <w:tc>

</xml_diff>

<commit_message>
Regenerate reports with leading outcome quadrant
Co-authored-by: drhycheung <115221187+drhycheung@users.noreply.github.com>
</commit_message>
<xml_diff>
--- a/examples/report-ai-hiring-boom_ethics.docx
+++ b/examples/report-ai-hiring-boom_ethics.docx
@@ -12,6 +12,14 @@
     </w:p>
     <w:p>
       <w:pPr>
+        <w:pStyle w:val="Heading1"/>
+      </w:pPr>
+      <w:r>
+        <w:t xml:space="preserve">Outcome quadrant: High risk × strong value · 😭 Boom-then-bust</w:t>
+      </w:r>
+    </w:p>
+    <w:p>
+      <w:pPr>
         <w:pStyle w:val="Heading2"/>
       </w:pPr>
       <w:r>
@@ -48,14 +56,6 @@
       </w:pPr>
       <w:r>
         <w:t xml:space="preserve">Type: Fail</w:t>
-      </w:r>
-    </w:p>
-    <w:p>
-      <w:pPr>
-        <w:pStyle w:val="Normal"/>
-      </w:pPr>
-      <w:r>
-        <w:t xml:space="preserve">Outcome quadrant: High risk × strong value · 😭 Boom-then-bust</w:t>
       </w:r>
     </w:p>
     <w:p>

</xml_diff>

<commit_message>
Place ending debrief in report section three
Co-authored-by: drhycheung <115221187+drhycheung@users.noreply.github.com>
</commit_message>
<xml_diff>
--- a/examples/report-ai-hiring-boom_ethics.docx
+++ b/examples/report-ai-hiring-boom_ethics.docx
@@ -12,14 +12,6 @@
     </w:p>
     <w:p>
       <w:pPr>
-        <w:pStyle w:val="Heading1"/>
-      </w:pPr>
-      <w:r>
-        <w:t xml:space="preserve">Outcome quadrant: High risk × strong value · 😭 Boom-then-bust</w:t>
-      </w:r>
-    </w:p>
-    <w:p>
-      <w:pPr>
         <w:pStyle w:val="Heading2"/>
       </w:pPr>
       <w:r>
@@ -40,22 +32,6 @@
       </w:pPr>
       <w:r>
         <w:t xml:space="preserve">Exported 16/10/2026, 09:12:35</w:t>
-      </w:r>
-    </w:p>
-    <w:p>
-      <w:pPr>
-        <w:pStyle w:val="Heading1"/>
-      </w:pPr>
-      <w:r>
-        <w:t xml:space="preserve">Ending: Users Finally Find Out They Were Sold</w:t>
-      </w:r>
-    </w:p>
-    <w:p>
-      <w:pPr>
-        <w:pStyle w:val="Normal"/>
-      </w:pPr>
-      <w:r>
-        <w:t xml:space="preserve">Type: Fail</w:t>
       </w:r>
     </w:p>
     <w:p>
@@ -635,7 +611,7 @@
         <w:pStyle w:val="Heading1"/>
       </w:pPr>
       <w:r>
-        <w:t xml:space="preserve">3. Decision trail (14 steps)</w:t>
+        <w:t xml:space="preserve">3. Ending debrief</w:t>
       </w:r>
     </w:p>
     <w:p>
@@ -643,7 +619,23 @@
         <w:pStyle w:val="Heading2"/>
       </w:pPr>
       <w:r>
-        <w:t xml:space="preserve">Step 1 · Act I · Customers and Problem (Canvas 1–2)</w:t>
+        <w:t xml:space="preserve">Outcome quadrant: High risk × strong value · 😭 Boom-then-bust</w:t>
+      </w:r>
+    </w:p>
+    <w:p>
+      <w:pPr>
+        <w:pStyle w:val="Heading2"/>
+      </w:pPr>
+      <w:r>
+        <w:t xml:space="preserve">Ending: Users Finally Find Out They Were Sold</w:t>
+      </w:r>
+    </w:p>
+    <w:p>
+      <w:pPr>
+        <w:pStyle w:val="Normal"/>
+      </w:pPr>
+      <w:r>
+        <w:t xml:space="preserve">Type: Fail</w:t>
       </w:r>
     </w:p>
     <w:p>
@@ -651,23 +643,15 @@
         <w:pStyle w:val="Story"/>
       </w:pPr>
       <w:r>
-        <w:t xml:space="preserve">Three of you finished version one in the incubator. An HR lead at a local manufacturer tried it and said it was the fastest screening tool she had ever used. Then she asked why certain candidates scored so low. Nobody could answer.</w:t>
-      </w:r>
-    </w:p>
-    <w:p>
-      <w:pPr>
-        <w:pStyle w:val="Choice"/>
-      </w:pPr>
-      <w:r>
-        <w:t xml:space="preserve">Your choice: Sign the pilot contract and form the team</w:t>
-      </w:r>
-    </w:p>
-    <w:p>
-      <w:pPr>
-        <w:pStyle w:val="Normal"/>
-      </w:pPr>
-      <w:r>
-        <w:t xml:space="preserve">Why: This turns the pilot opportunity into an operating venture and opens the later product and growth decisions. It does not change any score by itself; measurable effects begin with the next choice.</w:t>
+        <w:t xml:space="preserve">Commercial success hid one thing: users' trust was never matched by respect. When one user reverse-engineered your practices and published the whole thing, sentiment flipped overnight. Uninstalls, refunds, one-star reviews, press follow-ups — you did build a company, its foundation was just obtained by deception.</w:t>
+      </w:r>
+    </w:p>
+    <w:p>
+      <w:pPr>
+        <w:pStyle w:val="Flavour"/>
+      </w:pPr>
+      <w:r>
+        <w:t xml:space="preserve">The matched-pair test with only gender and age changed went viral.</w:t>
       </w:r>
     </w:p>
     <w:p>
@@ -675,23 +659,71 @@
         <w:pStyle w:val="Heading2"/>
       </w:pPr>
       <w:r>
-        <w:t xml:space="preserve">Step 2 · Act I · Customers and Problem (Canvas 1–2)</w:t>
-      </w:r>
-    </w:p>
-    <w:p>
-      <w:pPr>
-        <w:pStyle w:val="Story"/>
-      </w:pPr>
-      <w:r>
-        <w:t xml:space="preserve">First question: who do you serve first? The career centre says graduate CV volume is up another thirty per cent this year.</w:t>
-      </w:r>
-    </w:p>
-    <w:p>
-      <w:pPr>
-        <w:pStyle w:val="Choice"/>
-      </w:pPr>
-      <w:r>
-        <w:t xml:space="preserve">Your choice: Go deep on technical roles at small and mid-sized tech firms</w:t>
+        <w:t xml:space="preserve">Why this ending fired</w:t>
+      </w:r>
+    </w:p>
+    <w:p>
+      <w:pPr>
+        <w:pStyle w:val="Normal"/>
+      </w:pPr>
+      <w:r>
+        <w:t xml:space="preserve">Why it fired: ethics risk at 5+ with a business score of 6+ — the more users you harmed, the harder the backlash when it surfaced.</w:t>
+      </w:r>
+    </w:p>
+    <w:p>
+      <w:pPr>
+        <w:pStyle w:val="Heading2"/>
+      </w:pPr>
+      <w:r>
+        <w:t xml:space="preserve">The trade-off you made</w:t>
+      </w:r>
+    </w:p>
+    <w:p>
+      <w:pPr>
+        <w:pStyle w:val="Normal"/>
+      </w:pPr>
+      <w:r>
+        <w:t xml:space="preserve">The trade-off: trading absent informed consent for conversion. Every 'users won't read it anyway' decision improved the funnel on paper and added to a trust deficit that becomes unrecoverable once exposed.</w:t>
+      </w:r>
+    </w:p>
+    <w:p>
+      <w:pPr>
+        <w:pStyle w:val="Heading2"/>
+      </w:pPr>
+      <w:r>
+        <w:t xml:space="preserve">Through the Lean Canvas</w:t>
+      </w:r>
+    </w:p>
+    <w:p>
+      <w:pPr>
+        <w:pStyle w:val="Normal"/>
+      </w:pPr>
+      <w:r>
+        <w:t xml:space="preserve">Lean Canvas review: Canvas 8 (key metrics) tracked retention and conversion but no counter-metric like 'informed-user rate'; Canvas 9 (unfair advantage) mistook information asymmetry for an advantage — the most fragile kind there is.</w:t>
+      </w:r>
+    </w:p>
+    <w:p>
+      <w:pPr>
+        <w:pStyle w:val="Heading2"/>
+      </w:pPr>
+      <w:r>
+        <w:t xml:space="preserve">Legal and regulatory hooks</w:t>
+      </w:r>
+    </w:p>
+    <w:p>
+      <w:pPr>
+        <w:pStyle w:val="Normal"/>
+      </w:pPr>
+      <w:r>
+        <w:t xml:space="preserve">Classroom pointers: validity of notice and consent, separate consent for sensitive personal information, the right to explanation and to opt out of automated decisions, consumer protection and fair-trading rules.</w:t>
+      </w:r>
+    </w:p>
+    <w:p>
+      <w:pPr>
+        <w:pStyle w:val="Heading2"/>
+      </w:pPr>
+      <w:r>
+        <w:t xml:space="preserve">Who was affected</w:t>
       </w:r>
     </w:p>
     <w:tbl>
@@ -709,115 +741,104 @@
               <w:pStyle w:val="TableText"/>
             </w:pPr>
             <w:r>
-              <w:t xml:space="preserve">Dimension</w:t>
-            </w:r>
-          </w:p>
-        </w:tc>
-        <w:tc>
-          <w:tcPr>
-            <w:tcW w:w="0" w:type="auto"/>
-          </w:tcPr>
-          <w:p>
-            <w:pPr>
-              <w:pStyle w:val="TableText"/>
-            </w:pPr>
-            <w:r>
-              <w:t xml:space="preserve">Change</w:t>
-            </w:r>
-          </w:p>
-        </w:tc>
-        <w:tc>
-          <w:tcPr>
-            <w:tcW w:w="0" w:type="auto"/>
-          </w:tcPr>
-          <w:p>
-            <w:pPr>
-              <w:pStyle w:val="TableText"/>
-            </w:pPr>
-            <w:r>
-              <w:t xml:space="preserve">Verdict</w:t>
-            </w:r>
-          </w:p>
-        </w:tc>
-      </w:tr>
-      <w:tr>
-        <w:tc>
-          <w:tcPr>
-            <w:tcW w:w="0" w:type="auto"/>
-          </w:tcPr>
-          <w:p>
-            <w:pPr>
-              <w:pStyle w:val="TableText"/>
-            </w:pPr>
-            <w:r>
-              <w:t xml:space="preserve">Problem–solution fit</w:t>
-            </w:r>
-          </w:p>
-        </w:tc>
-        <w:tc>
-          <w:tcPr>
-            <w:tcW w:w="0" w:type="auto"/>
-          </w:tcPr>
-          <w:p>
-            <w:pPr>
-              <w:pStyle w:val="TableText"/>
-            </w:pPr>
-            <w:r>
-              <w:t xml:space="preserve">+2</w:t>
-            </w:r>
-          </w:p>
-        </w:tc>
-        <w:tc>
-          <w:tcPr>
-            <w:tcW w:w="0" w:type="auto"/>
-          </w:tcPr>
-          <w:p>
-            <w:pPr>
-              <w:pStyle w:val="TableText"/>
-            </w:pPr>
-            <w:r>
-              <w:t xml:space="preserve">better</w:t>
-            </w:r>
-          </w:p>
-        </w:tc>
-      </w:tr>
-      <w:tr>
-        <w:tc>
-          <w:tcPr>
-            <w:tcW w:w="0" w:type="auto"/>
-          </w:tcPr>
-          <w:p>
-            <w:pPr>
-              <w:pStyle w:val="TableText"/>
-            </w:pPr>
-            <w:r>
-              <w:t xml:space="preserve">Moat and unfair advantage</w:t>
-            </w:r>
-          </w:p>
-        </w:tc>
-        <w:tc>
-          <w:tcPr>
-            <w:tcW w:w="0" w:type="auto"/>
-          </w:tcPr>
-          <w:p>
-            <w:pPr>
-              <w:pStyle w:val="TableText"/>
-            </w:pPr>
-            <w:r>
-              <w:t xml:space="preserve">+1</w:t>
-            </w:r>
-          </w:p>
-        </w:tc>
-        <w:tc>
-          <w:tcPr>
-            <w:tcW w:w="0" w:type="auto"/>
-          </w:tcPr>
-          <w:p>
-            <w:pPr>
-              <w:pStyle w:val="TableText"/>
-            </w:pPr>
-            <w:r>
-              <w:t xml:space="preserve">better</w:t>
+              <w:t xml:space="preserve">Who</w:t>
+            </w:r>
+          </w:p>
+        </w:tc>
+        <w:tc>
+          <w:tcPr>
+            <w:tcW w:w="0" w:type="auto"/>
+          </w:tcPr>
+          <w:p>
+            <w:pPr>
+              <w:pStyle w:val="TableText"/>
+            </w:pPr>
+            <w:r>
+              <w:t xml:space="preserve">Impact</w:t>
+            </w:r>
+          </w:p>
+        </w:tc>
+      </w:tr>
+      <w:tr>
+        <w:tc>
+          <w:tcPr>
+            <w:tcW w:w="0" w:type="auto"/>
+          </w:tcPr>
+          <w:p>
+            <w:pPr>
+              <w:pStyle w:val="TableText"/>
+            </w:pPr>
+            <w:r>
+              <w:t xml:space="preserve">The most vulnerable affected users</w:t>
+            </w:r>
+          </w:p>
+        </w:tc>
+        <w:tc>
+          <w:tcPr>
+            <w:tcW w:w="0" w:type="auto"/>
+          </w:tcPr>
+          <w:p>
+            <w:pPr>
+              <w:pStyle w:val="TableText"/>
+            </w:pPr>
+            <w:r>
+              <w:t xml:space="preserve">Bore the most material harm — misjudgement, discrimination, exploitation — while receiving the least benefit.</w:t>
+            </w:r>
+          </w:p>
+        </w:tc>
+      </w:tr>
+      <w:tr>
+        <w:tc>
+          <w:tcPr>
+            <w:tcW w:w="0" w:type="auto"/>
+          </w:tcPr>
+          <w:p>
+            <w:pPr>
+              <w:pStyle w:val="TableText"/>
+            </w:pPr>
+            <w:r>
+              <w:t xml:space="preserve">The general user base</w:t>
+            </w:r>
+          </w:p>
+        </w:tc>
+        <w:tc>
+          <w:tcPr>
+            <w:tcW w:w="0" w:type="auto"/>
+          </w:tcPr>
+          <w:p>
+            <w:pPr>
+              <w:pStyle w:val="TableText"/>
+            </w:pPr>
+            <w:r>
+              <w:t xml:space="preserve">Discovered they were part of the product without knowing; the sense of betrayal outweighs any functional loss.</w:t>
+            </w:r>
+          </w:p>
+        </w:tc>
+      </w:tr>
+      <w:tr>
+        <w:tc>
+          <w:tcPr>
+            <w:tcW w:w="0" w:type="auto"/>
+          </w:tcPr>
+          <w:p>
+            <w:pPr>
+              <w:pStyle w:val="TableText"/>
+            </w:pPr>
+            <w:r>
+              <w:t xml:space="preserve">Advertising and commercial partners</w:t>
+            </w:r>
+          </w:p>
+        </w:tc>
+        <w:tc>
+          <w:tcPr>
+            <w:tcW w:w="0" w:type="auto"/>
+          </w:tcPr>
+          <w:p>
+            <w:pPr>
+              <w:pStyle w:val="TableText"/>
+            </w:pPr>
+            <w:r>
+              <w:t xml:space="preserve">Brand-safety damage spilled over and partnerships were halted at short notice.</w:t>
             </w:r>
           </w:p>
         </w:tc>
@@ -825,26 +846,66 @@
     </w:tbl>
     <w:p>
       <w:pPr>
-        <w:pStyle w:val="Normal"/>
-      </w:pPr>
-      <w:r>
-        <w:t xml:space="preserve">Why: One role type has comparatively objective criteria, easy to align on with HR and turn into a validation set; once that reputation forms it is the hardest part for a competitor to copy (Canvas 9). The market is limited, though.</w:t>
-      </w:r>
-    </w:p>
-    <w:p>
-      <w:pPr>
-        <w:pStyle w:val="Normal"/>
-      </w:pPr>
-      <w:r>
-        <w:t xml:space="preserve">Who can act: design</w:t>
-      </w:r>
-    </w:p>
-    <w:p>
-      <w:pPr>
         <w:pStyle w:val="Heading2"/>
       </w:pPr>
       <w:r>
-        <w:t xml:space="preserve">Step 3 · Act I · Customers and Problem (Canvas 1–2)</w:t>
+        <w:t xml:space="preserve">What you could have done</w:t>
+      </w:r>
+    </w:p>
+    <w:p>
+      <w:pPr>
+        <w:pStyle w:val="Normal"/>
+      </w:pPr>
+      <w:r>
+        <w:t xml:space="preserve">1. Make consequential decisions explainable, refusable and reversible: give reasons, provide an off switch, allow deletion.</w:t>
+      </w:r>
+    </w:p>
+    <w:p>
+      <w:pPr>
+        <w:pStyle w:val="Normal"/>
+      </w:pPr>
+      <w:r>
+        <w:t xml:space="preserve">2. Run impact tests disaggregated by vulnerable groups rather than trusting headline averages.</w:t>
+      </w:r>
+    </w:p>
+    <w:p>
+      <w:pPr>
+        <w:pStyle w:val="Normal"/>
+      </w:pPr>
+      <w:r>
+        <w:t xml:space="preserve">3. Write 'we will never do X with your data' into your commercial terms — and submit to an audit.</w:t>
+      </w:r>
+    </w:p>
+    <w:p>
+      <w:pPr>
+        <w:pStyle w:val="Heading2"/>
+      </w:pPr>
+      <w:r>
+        <w:t xml:space="preserve">Reflection</w:t>
+      </w:r>
+    </w:p>
+    <w:p>
+      <w:pPr>
+        <w:pStyle w:val="Normal"/>
+      </w:pPr>
+      <w:r>
+        <w:t xml:space="preserve">Translate 'users did not consent' into one concrete commercial consequence, and explain why it was bound to happen eventually.</w:t>
+      </w:r>
+    </w:p>
+    <w:p>
+      <w:pPr>
+        <w:pStyle w:val="Heading1"/>
+      </w:pPr>
+      <w:r>
+        <w:t xml:space="preserve">4. Decision trail (14 steps)</w:t>
+      </w:r>
+    </w:p>
+    <w:p>
+      <w:pPr>
+        <w:pStyle w:val="Heading2"/>
+      </w:pPr>
+      <w:r>
+        <w:t xml:space="preserve">Step 1 · Act I · Customers and Problem (Canvas 1–2)</w:t>
       </w:r>
     </w:p>
     <w:p>
@@ -852,7 +913,7 @@
         <w:pStyle w:val="Story"/>
       </w:pPr>
       <w:r>
-        <w:t xml:space="preserve">Second question: what is the real pain? Some say too many CVs; privately, one HR says she is afraid of being blamed for missing a good candidate. Right then the university careers service emails again: they want to buy a careers edition, provided it reports the way they need.</w:t>
+        <w:t xml:space="preserve">Three of you finished version one in the incubator. An HR lead at a local manufacturer tried it and said it was the fastest screening tool she had ever used. Then she asked why certain candidates scored so low. Nobody could answer.</w:t>
       </w:r>
     </w:p>
     <w:p>
@@ -860,7 +921,39 @@
         <w:pStyle w:val="Choice"/>
       </w:pPr>
       <w:r>
-        <w:t xml:space="preserve">Your choice: Ship an AI score and talent leaderboard so decisions take one click</w:t>
+        <w:t xml:space="preserve">Your choice: Sign the pilot contract and form the team</w:t>
+      </w:r>
+    </w:p>
+    <w:p>
+      <w:pPr>
+        <w:pStyle w:val="Normal"/>
+      </w:pPr>
+      <w:r>
+        <w:t xml:space="preserve">Why: This turns the pilot opportunity into an operating venture and opens the later product and growth decisions. It does not change any score by itself; measurable effects begin with the next choice.</w:t>
+      </w:r>
+    </w:p>
+    <w:p>
+      <w:pPr>
+        <w:pStyle w:val="Heading2"/>
+      </w:pPr>
+      <w:r>
+        <w:t xml:space="preserve">Step 2 · Act I · Customers and Problem (Canvas 1–2)</w:t>
+      </w:r>
+    </w:p>
+    <w:p>
+      <w:pPr>
+        <w:pStyle w:val="Story"/>
+      </w:pPr>
+      <w:r>
+        <w:t xml:space="preserve">First question: who do you serve first? The career centre says graduate CV volume is up another thirty per cent this year.</w:t>
+      </w:r>
+    </w:p>
+    <w:p>
+      <w:pPr>
+        <w:pStyle w:val="Choice"/>
+      </w:pPr>
+      <w:r>
+        <w:t xml:space="preserve">Your choice: Go deep on technical roles at small and mid-sized tech firms</w:t>
       </w:r>
     </w:p>
     <w:tbl>
@@ -919,7 +1012,7 @@
               <w:pStyle w:val="TableText"/>
             </w:pPr>
             <w:r>
-              <w:t xml:space="preserve">Business model</w:t>
+              <w:t xml:space="preserve">Problem–solution fit</w:t>
             </w:r>
           </w:p>
         </w:tc>
@@ -960,7 +1053,7 @@
               <w:pStyle w:val="TableText"/>
             </w:pPr>
             <w:r>
-              <w:t xml:space="preserve">Ethics and trust risk</w:t>
+              <w:t xml:space="preserve">Moat and unfair advantage</w:t>
             </w:r>
           </w:p>
         </w:tc>
@@ -986,48 +1079,7 @@
               <w:pStyle w:val="TableText"/>
             </w:pPr>
             <w:r>
-              <w:t xml:space="preserve">worse</w:t>
-            </w:r>
-          </w:p>
-        </w:tc>
-      </w:tr>
-      <w:tr>
-        <w:tc>
-          <w:tcPr>
-            <w:tcW w:w="0" w:type="auto"/>
-          </w:tcPr>
-          <w:p>
-            <w:pPr>
-              <w:pStyle w:val="TableText"/>
-            </w:pPr>
-            <w:r>
-              <w:t xml:space="preserve">Social expectation risk</w:t>
-            </w:r>
-          </w:p>
-        </w:tc>
-        <w:tc>
-          <w:tcPr>
-            <w:tcW w:w="0" w:type="auto"/>
-          </w:tcPr>
-          <w:p>
-            <w:pPr>
-              <w:pStyle w:val="TableText"/>
-            </w:pPr>
-            <w:r>
-              <w:t xml:space="preserve">+1</w:t>
-            </w:r>
-          </w:p>
-        </w:tc>
-        <w:tc>
-          <w:tcPr>
-            <w:tcW w:w="0" w:type="auto"/>
-          </w:tcPr>
-          <w:p>
-            <w:pPr>
-              <w:pStyle w:val="TableText"/>
-            </w:pPr>
-            <w:r>
-              <w:t xml:space="preserve">worse</w:t>
+              <w:t xml:space="preserve">better</w:t>
             </w:r>
           </w:p>
         </w:tc>
@@ -1038,7 +1090,7 @@
         <w:pStyle w:val="Normal"/>
       </w:pPr>
       <w:r>
-        <w:t xml:space="preserve">Why: One-click decisions match the 'save time' purchasing rationale and are easy to sign. But collapsing someone's future into one number removes the ability to question it, and accountability for automated decisions starts to vanish.</w:t>
+        <w:t xml:space="preserve">Why: One role type has comparatively objective criteria, easy to align on with HR and turn into a validation set; once that reputation forms it is the hardest part for a competitor to copy (Canvas 9). The market is limited, though.</w:t>
       </w:r>
     </w:p>
     <w:p>
@@ -1054,7 +1106,7 @@
         <w:pStyle w:val="Heading2"/>
       </w:pPr>
       <w:r>
-        <w:t xml:space="preserve">Step 4 · Act II · Solution, Data and Training (Canvas 3–4)</w:t>
+        <w:t xml:space="preserve">Step 3 · Act I · Customers and Problem (Canvas 1–2)</w:t>
       </w:r>
     </w:p>
     <w:p>
@@ -1062,7 +1114,7 @@
         <w:pStyle w:val="Story"/>
       </w:pPr>
       <w:r>
-        <w:t xml:space="preserve">Two MVP candidates: give HR the reasoning, or give HR the verdict?</w:t>
+        <w:t xml:space="preserve">Second question: what is the real pain? Some say too many CVs; privately, one HR says she is afraid of being blamed for missing a good candidate. Right then the university careers service emails again: they want to buy a careers edition, provided it reports the way they need.</w:t>
       </w:r>
     </w:p>
     <w:p>
@@ -1070,7 +1122,7 @@
         <w:pStyle w:val="Choice"/>
       </w:pPr>
       <w:r>
-        <w:t xml:space="preserve">Your choice: Candidate search with a scoring leaderboard so companies can 'shop' people</w:t>
+        <w:t xml:space="preserve">Your choice: Ship an AI score and talent leaderboard so decisions take one click</w:t>
       </w:r>
     </w:p>
     <w:tbl>
@@ -1170,7 +1222,7 @@
               <w:pStyle w:val="TableText"/>
             </w:pPr>
             <w:r>
-              <w:t xml:space="preserve">National security risk</w:t>
+              <w:t xml:space="preserve">Ethics and trust risk</w:t>
             </w:r>
           </w:p>
         </w:tc>
@@ -1224,7 +1276,7 @@
               <w:pStyle w:val="TableText"/>
             </w:pPr>
             <w:r>
-              <w:t xml:space="preserve">+2</w:t>
+              <w:t xml:space="preserve">+1</w:t>
             </w:r>
           </w:p>
         </w:tc>
@@ -1248,7 +1300,7 @@
         <w:pStyle w:val="Normal"/>
       </w:pPr>
       <w:r>
-        <w:t xml:space="preserve">Why: A searchable talent pool monetises well and spreads fast, but concentrating structured profiles of a local workforce — including people in critical roles and industries — creates an asset of very high sensitivity.</w:t>
+        <w:t xml:space="preserve">Why: One-click decisions match the 'save time' purchasing rationale and are easy to sign. But collapsing someone's future into one number removes the ability to question it, and accountability for automated decisions starts to vanish.</w:t>
       </w:r>
     </w:p>
     <w:p>
@@ -1264,7 +1316,7 @@
         <w:pStyle w:val="Heading2"/>
       </w:pPr>
       <w:r>
-        <w:t xml:space="preserve">Step 5 · Act II · Solution, Data and Training (Canvas 3–4)</w:t>
+        <w:t xml:space="preserve">Step 4 · Act II · Solution, Data and Training (Canvas 3–4)</w:t>
       </w:r>
     </w:p>
     <w:p>
@@ -1272,7 +1324,7 @@
         <w:pStyle w:val="Story"/>
       </w:pPr>
       <w:r>
-        <w:t xml:space="preserve">To read job specs the model needs a full skill taxonomy and job mapping. Building it takes months; an overseas vendor sells a ready-made API.</w:t>
+        <w:t xml:space="preserve">Two MVP candidates: give HR the reasoning, or give HR the verdict?</w:t>
       </w:r>
     </w:p>
     <w:p>
@@ -1280,7 +1332,7 @@
         <w:pStyle w:val="Choice"/>
       </w:pPr>
       <w:r>
-        <w:t xml:space="preserve">Your choice: Build a local taxonomy on published industry classification standards</w:t>
+        <w:t xml:space="preserve">Your choice: Candidate search with a scoring leaderboard so companies can 'shop' people</w:t>
       </w:r>
     </w:p>
     <w:tbl>
@@ -1339,7 +1391,48 @@
               <w:pStyle w:val="TableText"/>
             </w:pPr>
             <w:r>
-              <w:t xml:space="preserve">Problem–solution fit</w:t>
+              <w:t xml:space="preserve">Business model</w:t>
+            </w:r>
+          </w:p>
+        </w:tc>
+        <w:tc>
+          <w:tcPr>
+            <w:tcW w:w="0" w:type="auto"/>
+          </w:tcPr>
+          <w:p>
+            <w:pPr>
+              <w:pStyle w:val="TableText"/>
+            </w:pPr>
+            <w:r>
+              <w:t xml:space="preserve">+2</w:t>
+            </w:r>
+          </w:p>
+        </w:tc>
+        <w:tc>
+          <w:tcPr>
+            <w:tcW w:w="0" w:type="auto"/>
+          </w:tcPr>
+          <w:p>
+            <w:pPr>
+              <w:pStyle w:val="TableText"/>
+            </w:pPr>
+            <w:r>
+              <w:t xml:space="preserve">better</w:t>
+            </w:r>
+          </w:p>
+        </w:tc>
+      </w:tr>
+      <w:tr>
+        <w:tc>
+          <w:tcPr>
+            <w:tcW w:w="0" w:type="auto"/>
+          </w:tcPr>
+          <w:p>
+            <w:pPr>
+              <w:pStyle w:val="TableText"/>
+            </w:pPr>
+            <w:r>
+              <w:t xml:space="preserve">National security risk</w:t>
             </w:r>
           </w:p>
         </w:tc>
@@ -1365,7 +1458,48 @@
               <w:pStyle w:val="TableText"/>
             </w:pPr>
             <w:r>
-              <w:t xml:space="preserve">better</w:t>
+              <w:t xml:space="preserve">worse</w:t>
+            </w:r>
+          </w:p>
+        </w:tc>
+      </w:tr>
+      <w:tr>
+        <w:tc>
+          <w:tcPr>
+            <w:tcW w:w="0" w:type="auto"/>
+          </w:tcPr>
+          <w:p>
+            <w:pPr>
+              <w:pStyle w:val="TableText"/>
+            </w:pPr>
+            <w:r>
+              <w:t xml:space="preserve">Social expectation risk</w:t>
+            </w:r>
+          </w:p>
+        </w:tc>
+        <w:tc>
+          <w:tcPr>
+            <w:tcW w:w="0" w:type="auto"/>
+          </w:tcPr>
+          <w:p>
+            <w:pPr>
+              <w:pStyle w:val="TableText"/>
+            </w:pPr>
+            <w:r>
+              <w:t xml:space="preserve">+2</w:t>
+            </w:r>
+          </w:p>
+        </w:tc>
+        <w:tc>
+          <w:tcPr>
+            <w:tcW w:w="0" w:type="auto"/>
+          </w:tcPr>
+          <w:p>
+            <w:pPr>
+              <w:pStyle w:val="TableText"/>
+            </w:pPr>
+            <w:r>
+              <w:t xml:space="preserve">worse</w:t>
             </w:r>
           </w:p>
         </w:tc>
@@ -1376,15 +1510,15 @@
         <w:pStyle w:val="Normal"/>
       </w:pPr>
       <w:r>
-        <w:t xml:space="preserve">Why: Building it in-house is slower but stays explainable: clear provenance, maintainable, and you can account for every weight when challenged. Localisation also improves matching quality.</w:t>
-      </w:r>
-    </w:p>
-    <w:p>
-      <w:pPr>
-        <w:pStyle w:val="Normal"/>
-      </w:pPr>
-      <w:r>
-        <w:t xml:space="preserve">Who can act: company policy</w:t>
+        <w:t xml:space="preserve">Why: A searchable talent pool monetises well and spreads fast, but concentrating structured profiles of a local workforce — including people in critical roles and industries — creates an asset of very high sensitivity.</w:t>
+      </w:r>
+    </w:p>
+    <w:p>
+      <w:pPr>
+        <w:pStyle w:val="Normal"/>
+      </w:pPr>
+      <w:r>
+        <w:t xml:space="preserve">Who can act: design</w:t>
       </w:r>
     </w:p>
     <w:p>
@@ -1392,7 +1526,7 @@
         <w:pStyle w:val="Heading2"/>
       </w:pPr>
       <w:r>
-        <w:t xml:space="preserve">Step 6 · Act II · Solution, Data and Training (Canvas 3–4)</w:t>
+        <w:t xml:space="preserve">Step 5 · Act II · Solution, Data and Training (Canvas 3–4)</w:t>
       </w:r>
     </w:p>
     <w:p>
@@ -1400,7 +1534,7 @@
         <w:pStyle w:val="Story"/>
       </w:pPr>
       <w:r>
-        <w:t xml:space="preserve">Validating the model needs historical hiring outcomes, and the pilot firm released only a slice. The team worries the model will look dumb.</w:t>
+        <w:t xml:space="preserve">To read job specs the model needs a full skill taxonomy and job mapping. Building it takes months; an overseas vendor sells a ready-made API.</w:t>
       </w:r>
     </w:p>
     <w:p>
@@ -1408,7 +1542,7 @@
         <w:pStyle w:val="Choice"/>
       </w:pPr>
       <w:r>
-        <w:t xml:space="preserve">Your choice: Use only data the pilot covered in writing and accept a small sample</w:t>
+        <w:t xml:space="preserve">Your choice: Build a local taxonomy on published industry classification standards</w:t>
       </w:r>
     </w:p>
     <w:tbl>
@@ -1504,7 +1638,7 @@
         <w:pStyle w:val="Normal"/>
       </w:pPr>
       <w:r>
-        <w:t xml:space="preserve">Why: A small sample makes the metrics look worse for now, but a complete authorisation chain survives due diligence, scrutiny and client counsel questions later. You trade pace for correctness.</w:t>
+        <w:t xml:space="preserve">Why: Building it in-house is slower but stays explainable: clear provenance, maintainable, and you can account for every weight when challenged. Localisation also improves matching quality.</w:t>
       </w:r>
     </w:p>
     <w:p>
@@ -1520,7 +1654,7 @@
         <w:pStyle w:val="Heading2"/>
       </w:pPr>
       <w:r>
-        <w:t xml:space="preserve">Step 7 · Act II · Solution, Data and Training (Canvas 3–4)</w:t>
+        <w:t xml:space="preserve">Step 6 · Act II · Solution, Data and Training (Canvas 3–4)</w:t>
       </w:r>
     </w:p>
     <w:p>
@@ -1528,7 +1662,7 @@
         <w:pStyle w:val="Story"/>
       </w:pPr>
       <w:r>
-        <w:t xml:space="preserve">Trained only on authorised data, the model has a small, narrow sample and degrades outside the pilot firm's job families. But for every score you can say which fields it relied on.</w:t>
+        <w:t xml:space="preserve">Validating the model needs historical hiring outcomes, and the pilot firm released only a slice. The team worries the model will look dumb.</w:t>
       </w:r>
     </w:p>
     <w:p>
@@ -1536,7 +1670,7 @@
         <w:pStyle w:val="Choice"/>
       </w:pPr>
       <w:r>
-        <w:t xml:space="preserve">Your choice: Claim algorithmic compliance; release the basis only after a complaint</w:t>
+        <w:t xml:space="preserve">Your choice: Use only data the pilot covered in writing and accept a small sample</w:t>
       </w:r>
     </w:p>
     <w:tbl>
@@ -1595,20 +1729,20 @@
               <w:pStyle w:val="TableText"/>
             </w:pPr>
             <w:r>
-              <w:t xml:space="preserve">Business model</w:t>
-            </w:r>
-          </w:p>
-        </w:tc>
-        <w:tc>
-          <w:tcPr>
-            <w:tcW w:w="0" w:type="auto"/>
-          </w:tcPr>
-          <w:p>
-            <w:pPr>
-              <w:pStyle w:val="TableText"/>
-            </w:pPr>
-            <w:r>
-              <w:t xml:space="preserve">+2</w:t>
+              <w:t xml:space="preserve">Problem–solution fit</w:t>
+            </w:r>
+          </w:p>
+        </w:tc>
+        <w:tc>
+          <w:tcPr>
+            <w:tcW w:w="0" w:type="auto"/>
+          </w:tcPr>
+          <w:p>
+            <w:pPr>
+              <w:pStyle w:val="TableText"/>
+            </w:pPr>
+            <w:r>
+              <w:t xml:space="preserve">+1</w:t>
             </w:r>
           </w:p>
         </w:tc>
@@ -1626,95 +1760,13 @@
           </w:p>
         </w:tc>
       </w:tr>
-      <w:tr>
-        <w:tc>
-          <w:tcPr>
-            <w:tcW w:w="0" w:type="auto"/>
-          </w:tcPr>
-          <w:p>
-            <w:pPr>
-              <w:pStyle w:val="TableText"/>
-            </w:pPr>
-            <w:r>
-              <w:t xml:space="preserve">Ethics and trust risk</w:t>
-            </w:r>
-          </w:p>
-        </w:tc>
-        <w:tc>
-          <w:tcPr>
-            <w:tcW w:w="0" w:type="auto"/>
-          </w:tcPr>
-          <w:p>
-            <w:pPr>
-              <w:pStyle w:val="TableText"/>
-            </w:pPr>
-            <w:r>
-              <w:t xml:space="preserve">+1</w:t>
-            </w:r>
-          </w:p>
-        </w:tc>
-        <w:tc>
-          <w:tcPr>
-            <w:tcW w:w="0" w:type="auto"/>
-          </w:tcPr>
-          <w:p>
-            <w:pPr>
-              <w:pStyle w:val="TableText"/>
-            </w:pPr>
-            <w:r>
-              <w:t xml:space="preserve">worse</w:t>
-            </w:r>
-          </w:p>
-        </w:tc>
-      </w:tr>
-      <w:tr>
-        <w:tc>
-          <w:tcPr>
-            <w:tcW w:w="0" w:type="auto"/>
-          </w:tcPr>
-          <w:p>
-            <w:pPr>
-              <w:pStyle w:val="TableText"/>
-            </w:pPr>
-            <w:r>
-              <w:t xml:space="preserve">Social expectation risk</w:t>
-            </w:r>
-          </w:p>
-        </w:tc>
-        <w:tc>
-          <w:tcPr>
-            <w:tcW w:w="0" w:type="auto"/>
-          </w:tcPr>
-          <w:p>
-            <w:pPr>
-              <w:pStyle w:val="TableText"/>
-            </w:pPr>
-            <w:r>
-              <w:t xml:space="preserve">+1</w:t>
-            </w:r>
-          </w:p>
-        </w:tc>
-        <w:tc>
-          <w:tcPr>
-            <w:tcW w:w="0" w:type="auto"/>
-          </w:tcPr>
-          <w:p>
-            <w:pPr>
-              <w:pStyle w:val="TableText"/>
-            </w:pPr>
-            <w:r>
-              <w:t xml:space="preserve">worse</w:t>
-            </w:r>
-          </w:p>
-        </w:tc>
-      </w:tr>
     </w:tbl>
     <w:p>
       <w:pPr>
         <w:pStyle w:val="Normal"/>
       </w:pPr>
       <w:r>
-        <w:t xml:space="preserve">Why: Business rises because you skip maintaining the scoring basis and sell more easily. Ethics and social expectation fall together: candidates were entitled to know what they were compared on, and you told nobody until a complaint arrived.</w:t>
+        <w:t xml:space="preserve">Why: A small sample makes the metrics look worse for now, but a complete authorisation chain survives due diligence, scrutiny and client counsel questions later. You trade pace for correctness.</w:t>
       </w:r>
     </w:p>
     <w:p>
@@ -1730,7 +1782,7 @@
         <w:pStyle w:val="Heading2"/>
       </w:pPr>
       <w:r>
-        <w:t xml:space="preserve">Step 8 · Act III · Channels, Revenue and Accountability (Canvas 5–8)</w:t>
+        <w:t xml:space="preserve">Step 7 · Act II · Solution, Data and Training (Canvas 3–4)</w:t>
       </w:r>
     </w:p>
     <w:p>
@@ -1738,7 +1790,7 @@
         <w:pStyle w:val="Story"/>
       </w:pPr>
       <w:r>
-        <w:t xml:space="preserve">You have a clean authorisation chain — how do you turn 'explainable scoring' into revenue? Sales wants a model where HR pays almost nothing — yet you would have to monetise the candidate data entrusted to you to make money, which is exactly what betrays your 'trustworthy' edge.</w:t>
+        <w:t xml:space="preserve">Trained only on authorised data, the model has a small, narrow sample and degrades outside the pilot firm's job families. But for every score you can say which fields it relied on.</w:t>
       </w:r>
     </w:p>
     <w:p>
@@ -1746,7 +1798,7 @@
         <w:pStyle w:val="Choice"/>
       </w:pPr>
       <w:r>
-        <w:t xml:space="preserve">Your choice: Per-seat subscription with a written promise never to resell candidate data</w:t>
+        <w:t xml:space="preserve">Your choice: Claim algorithmic compliance; release the basis only after a complaint</w:t>
       </w:r>
     </w:p>
     <w:tbl>
@@ -1846,7 +1898,7 @@
               <w:pStyle w:val="TableText"/>
             </w:pPr>
             <w:r>
-              <w:t xml:space="preserve">Moat and unfair advantage</w:t>
+              <w:t xml:space="preserve">Ethics and trust risk</w:t>
             </w:r>
           </w:p>
         </w:tc>
@@ -1872,7 +1924,48 @@
               <w:pStyle w:val="TableText"/>
             </w:pPr>
             <w:r>
-              <w:t xml:space="preserve">better</w:t>
+              <w:t xml:space="preserve">worse</w:t>
+            </w:r>
+          </w:p>
+        </w:tc>
+      </w:tr>
+      <w:tr>
+        <w:tc>
+          <w:tcPr>
+            <w:tcW w:w="0" w:type="auto"/>
+          </w:tcPr>
+          <w:p>
+            <w:pPr>
+              <w:pStyle w:val="TableText"/>
+            </w:pPr>
+            <w:r>
+              <w:t xml:space="preserve">Social expectation risk</w:t>
+            </w:r>
+          </w:p>
+        </w:tc>
+        <w:tc>
+          <w:tcPr>
+            <w:tcW w:w="0" w:type="auto"/>
+          </w:tcPr>
+          <w:p>
+            <w:pPr>
+              <w:pStyle w:val="TableText"/>
+            </w:pPr>
+            <w:r>
+              <w:t xml:space="preserve">+1</w:t>
+            </w:r>
+          </w:p>
+        </w:tc>
+        <w:tc>
+          <w:tcPr>
+            <w:tcW w:w="0" w:type="auto"/>
+          </w:tcPr>
+          <w:p>
+            <w:pPr>
+              <w:pStyle w:val="TableText"/>
+            </w:pPr>
+            <w:r>
+              <w:t xml:space="preserve">worse</w:t>
             </w:r>
           </w:p>
         </w:tc>
@@ -1883,7 +1976,7 @@
         <w:pStyle w:val="Normal"/>
       </w:pPr>
       <w:r>
-        <w:t xml:space="preserve">Why: Subscriptions collect money slowest, but 'we never resell' written into the contract becomes a two-sided promise to candidates and HR alike — and in this industry trust is the hardest advantage to copy (Canvas 9).</w:t>
+        <w:t xml:space="preserve">Why: Business rises because you skip maintaining the scoring basis and sell more easily. Ethics and social expectation fall together: candidates were entitled to know what they were compared on, and you told nobody until a complaint arrived.</w:t>
       </w:r>
     </w:p>
     <w:p>
@@ -1899,7 +1992,7 @@
         <w:pStyle w:val="Heading2"/>
       </w:pPr>
       <w:r>
-        <w:t xml:space="preserve">Step 9 · Act III · Channels, Revenue and Accountability (Canvas 5–8)</w:t>
+        <w:t xml:space="preserve">Step 8 · Act III · Channels, Revenue and Accountability (Canvas 5–8)</w:t>
       </w:r>
     </w:p>
     <w:p>
@@ -1907,7 +2000,7 @@
         <w:pStyle w:val="Story"/>
       </w:pPr>
       <w:r>
-        <w:t xml:space="preserve">How do you reach more employers? One recruitment agent says he can put you in front of three hundred firms. You hold an 'explainable' reputation asset — how do you amplify it?</w:t>
+        <w:t xml:space="preserve">You have a clean authorisation chain — how do you turn 'explainable scoring' into revenue? Sales wants a model where HR pays almost nothing — yet you would have to monetise the candidate data entrusted to you to make money, which is exactly what betrays your 'trustworthy' edge.</w:t>
       </w:r>
     </w:p>
     <w:p>
@@ -1915,7 +2008,7 @@
         <w:pStyle w:val="Choice"/>
       </w:pPr>
       <w:r>
-        <w:t xml:space="preserve">Your choice: Grow through HR communities and referrals, taking only clients you can serve</w:t>
+        <w:t xml:space="preserve">Your choice: Per-seat subscription with a written promise never to resell candidate data</w:t>
       </w:r>
     </w:p>
     <w:tbl>
@@ -1987,35 +2080,35 @@
               <w:pStyle w:val="TableText"/>
             </w:pPr>
             <w:r>
-              <w:t xml:space="preserve">0</w:t>
-            </w:r>
-          </w:p>
-        </w:tc>
-        <w:tc>
-          <w:tcPr>
-            <w:tcW w:w="0" w:type="auto"/>
-          </w:tcPr>
-          <w:p>
-            <w:pPr>
-              <w:pStyle w:val="TableText"/>
-            </w:pPr>
-            <w:r>
-              <w:t xml:space="preserve">unchanged</w:t>
-            </w:r>
-          </w:p>
-        </w:tc>
-      </w:tr>
-      <w:tr>
-        <w:tc>
-          <w:tcPr>
-            <w:tcW w:w="0" w:type="auto"/>
-          </w:tcPr>
-          <w:p>
-            <w:pPr>
-              <w:pStyle w:val="TableText"/>
-            </w:pPr>
-            <w:r>
-              <w:t xml:space="preserve">Problem–solution fit</w:t>
+              <w:t xml:space="preserve">+2</w:t>
+            </w:r>
+          </w:p>
+        </w:tc>
+        <w:tc>
+          <w:tcPr>
+            <w:tcW w:w="0" w:type="auto"/>
+          </w:tcPr>
+          <w:p>
+            <w:pPr>
+              <w:pStyle w:val="TableText"/>
+            </w:pPr>
+            <w:r>
+              <w:t xml:space="preserve">better</w:t>
+            </w:r>
+          </w:p>
+        </w:tc>
+      </w:tr>
+      <w:tr>
+        <w:tc>
+          <w:tcPr>
+            <w:tcW w:w="0" w:type="auto"/>
+          </w:tcPr>
+          <w:p>
+            <w:pPr>
+              <w:pStyle w:val="TableText"/>
+            </w:pPr>
+            <w:r>
+              <w:t xml:space="preserve">Moat and unfair advantage</w:t>
             </w:r>
           </w:p>
         </w:tc>
@@ -2052,7 +2145,7 @@
         <w:pStyle w:val="Normal"/>
       </w:pPr>
       <w:r>
-        <w:t xml:space="preserve">Why: It is slow, but every client forces you to explain your scoring, which raises fit; referrals are the cheapest channel per win and renew best (Canvas 5).</w:t>
+        <w:t xml:space="preserve">Why: Subscriptions collect money slowest, but 'we never resell' written into the contract becomes a two-sided promise to candidates and HR alike — and in this industry trust is the hardest advantage to copy (Canvas 9).</w:t>
       </w:r>
     </w:p>
     <w:p>
@@ -2068,7 +2161,7 @@
         <w:pStyle w:val="Heading2"/>
       </w:pPr>
       <w:r>
-        <w:t xml:space="preserve">Step 10 · Act III · Channels, Revenue and Accountability (Canvas 5–8)</w:t>
+        <w:t xml:space="preserve">Step 9 · Act III · Channels, Revenue and Accountability (Canvas 5–8)</w:t>
       </w:r>
     </w:p>
     <w:p>
@@ -2076,7 +2169,7 @@
         <w:pStyle w:val="Story"/>
       </w:pPr>
       <w:r>
-        <w:t xml:space="preserve">A friend in law school warns: if an AI helps decide who gets an interview, candidates usually have the right to know and to request human review. Your line lives on 'explainable' — make it the default, or hide it for conversion?</w:t>
+        <w:t xml:space="preserve">How do you reach more employers? One recruitment agent says he can put you in front of three hundred firms. You hold an 'explainable' reputation asset — how do you amplify it?</w:t>
       </w:r>
     </w:p>
     <w:p>
@@ -2084,7 +2177,7 @@
         <w:pStyle w:val="Choice"/>
       </w:pPr>
       <w:r>
-        <w:t xml:space="preserve">Your choice: No candidate-facing disclosure; externally it is a 'system assessment'</w:t>
+        <w:t xml:space="preserve">Your choice: Grow through HR communities and referrals, taking only clients you can serve</w:t>
       </w:r>
     </w:p>
     <w:tbl>
@@ -2184,115 +2277,33 @@
               <w:pStyle w:val="TableText"/>
             </w:pPr>
             <w:r>
-              <w:t xml:space="preserve">Legal compliance risk</w:t>
-            </w:r>
-          </w:p>
-        </w:tc>
-        <w:tc>
-          <w:tcPr>
-            <w:tcW w:w="0" w:type="auto"/>
-          </w:tcPr>
-          <w:p>
-            <w:pPr>
-              <w:pStyle w:val="TableText"/>
-            </w:pPr>
-            <w:r>
-              <w:t xml:space="preserve">+3</w:t>
-            </w:r>
-          </w:p>
-        </w:tc>
-        <w:tc>
-          <w:tcPr>
-            <w:tcW w:w="0" w:type="auto"/>
-          </w:tcPr>
-          <w:p>
-            <w:pPr>
-              <w:pStyle w:val="TableText"/>
-            </w:pPr>
-            <w:r>
-              <w:t xml:space="preserve">worse</w:t>
-            </w:r>
-          </w:p>
-        </w:tc>
-      </w:tr>
-      <w:tr>
-        <w:tc>
-          <w:tcPr>
-            <w:tcW w:w="0" w:type="auto"/>
-          </w:tcPr>
-          <w:p>
-            <w:pPr>
-              <w:pStyle w:val="TableText"/>
-            </w:pPr>
-            <w:r>
-              <w:t xml:space="preserve">Ethics and trust risk</w:t>
-            </w:r>
-          </w:p>
-        </w:tc>
-        <w:tc>
-          <w:tcPr>
-            <w:tcW w:w="0" w:type="auto"/>
-          </w:tcPr>
-          <w:p>
-            <w:pPr>
-              <w:pStyle w:val="TableText"/>
-            </w:pPr>
-            <w:r>
-              <w:t xml:space="preserve">+2</w:t>
-            </w:r>
-          </w:p>
-        </w:tc>
-        <w:tc>
-          <w:tcPr>
-            <w:tcW w:w="0" w:type="auto"/>
-          </w:tcPr>
-          <w:p>
-            <w:pPr>
-              <w:pStyle w:val="TableText"/>
-            </w:pPr>
-            <w:r>
-              <w:t xml:space="preserve">worse</w:t>
-            </w:r>
-          </w:p>
-        </w:tc>
-      </w:tr>
-      <w:tr>
-        <w:tc>
-          <w:tcPr>
-            <w:tcW w:w="0" w:type="auto"/>
-          </w:tcPr>
-          <w:p>
-            <w:pPr>
-              <w:pStyle w:val="TableText"/>
-            </w:pPr>
-            <w:r>
-              <w:t xml:space="preserve">Social expectation risk</w:t>
-            </w:r>
-          </w:p>
-        </w:tc>
-        <w:tc>
-          <w:tcPr>
-            <w:tcW w:w="0" w:type="auto"/>
-          </w:tcPr>
-          <w:p>
-            <w:pPr>
-              <w:pStyle w:val="TableText"/>
-            </w:pPr>
-            <w:r>
-              <w:t xml:space="preserve">+2</w:t>
-            </w:r>
-          </w:p>
-        </w:tc>
-        <w:tc>
-          <w:tcPr>
-            <w:tcW w:w="0" w:type="auto"/>
-          </w:tcPr>
-          <w:p>
-            <w:pPr>
-              <w:pStyle w:val="TableText"/>
-            </w:pPr>
-            <w:r>
-              <w:t xml:space="preserve">worse</w:t>
+              <w:t xml:space="preserve">Problem–solution fit</w:t>
+            </w:r>
+          </w:p>
+        </w:tc>
+        <w:tc>
+          <w:tcPr>
+            <w:tcW w:w="0" w:type="auto"/>
+          </w:tcPr>
+          <w:p>
+            <w:pPr>
+              <w:pStyle w:val="TableText"/>
+            </w:pPr>
+            <w:r>
+              <w:t xml:space="preserve">+1</w:t>
+            </w:r>
+          </w:p>
+        </w:tc>
+        <w:tc>
+          <w:tcPr>
+            <w:tcW w:w="0" w:type="auto"/>
+          </w:tcPr>
+          <w:p>
+            <w:pPr>
+              <w:pStyle w:val="TableText"/>
+            </w:pPr>
+            <w:r>
+              <w:t xml:space="preserve">better</w:t>
             </w:r>
           </w:p>
         </w:tc>
@@ -2303,15 +2314,15 @@
         <w:pStyle w:val="Normal"/>
       </w:pPr>
       <w:r>
-        <w:t xml:space="preserve">Why: Not disclosing avoids a lot of explaining and keeps clients comfortable. But automated decisions touching employment increasingly require notice, explanation and human involvement; concealment is typically treated as procedural unfairness.</w:t>
-      </w:r>
-    </w:p>
-    <w:p>
-      <w:pPr>
-        <w:pStyle w:val="Normal"/>
-      </w:pPr>
-      <w:r>
-        <w:t xml:space="preserve">Who can act: law</w:t>
+        <w:t xml:space="preserve">Why: It is slow, but every client forces you to explain your scoring, which raises fit; referrals are the cheapest channel per win and renew best (Canvas 5).</w:t>
+      </w:r>
+    </w:p>
+    <w:p>
+      <w:pPr>
+        <w:pStyle w:val="Normal"/>
+      </w:pPr>
+      <w:r>
+        <w:t xml:space="preserve">Who can act: company policy</w:t>
       </w:r>
     </w:p>
     <w:p>
@@ -2319,7 +2330,7 @@
         <w:pStyle w:val="Heading2"/>
       </w:pPr>
       <w:r>
-        <w:t xml:space="preserve">Step 11 · Act III · Channels, Revenue and Accountability (Canvas 5–8)</w:t>
+        <w:t xml:space="preserve">Step 10 · Act III · Channels, Revenue and Accountability (Canvas 5–8)</w:t>
       </w:r>
     </w:p>
     <w:p>
@@ -2327,7 +2338,7 @@
         <w:pStyle w:val="Story"/>
       </w:pPr>
       <w:r>
-        <w:t xml:space="preserve">Internal testing shows systematically lower scores for people with long career gaps, candidates over forty, and anyone without a famous employer on their CV. Someone argues the data simply looks like that.</w:t>
+        <w:t xml:space="preserve">A friend in law school warns: if an AI helps decide who gets an interview, candidates usually have the right to know and to request human review. Your line lives on 'explainable' — make it the default, or hide it for conversion?</w:t>
       </w:r>
     </w:p>
     <w:p>
@@ -2335,7 +2346,7 @@
         <w:pStyle w:val="Choice"/>
       </w:pPr>
       <w:r>
-        <w:t xml:space="preserve">Your choice: Ship now and declare the intended population as 'graduates of leading institutions'</w:t>
+        <w:t xml:space="preserve">Your choice: No candidate-facing disclosure; externally it is a 'system assessment'</w:t>
       </w:r>
     </w:p>
     <w:tbl>
@@ -2394,6 +2405,88 @@
               <w:pStyle w:val="TableText"/>
             </w:pPr>
             <w:r>
+              <w:t xml:space="preserve">Business model</w:t>
+            </w:r>
+          </w:p>
+        </w:tc>
+        <w:tc>
+          <w:tcPr>
+            <w:tcW w:w="0" w:type="auto"/>
+          </w:tcPr>
+          <w:p>
+            <w:pPr>
+              <w:pStyle w:val="TableText"/>
+            </w:pPr>
+            <w:r>
+              <w:t xml:space="preserve">0</w:t>
+            </w:r>
+          </w:p>
+        </w:tc>
+        <w:tc>
+          <w:tcPr>
+            <w:tcW w:w="0" w:type="auto"/>
+          </w:tcPr>
+          <w:p>
+            <w:pPr>
+              <w:pStyle w:val="TableText"/>
+            </w:pPr>
+            <w:r>
+              <w:t xml:space="preserve">unchanged</w:t>
+            </w:r>
+          </w:p>
+        </w:tc>
+      </w:tr>
+      <w:tr>
+        <w:tc>
+          <w:tcPr>
+            <w:tcW w:w="0" w:type="auto"/>
+          </w:tcPr>
+          <w:p>
+            <w:pPr>
+              <w:pStyle w:val="TableText"/>
+            </w:pPr>
+            <w:r>
+              <w:t xml:space="preserve">Legal compliance risk</w:t>
+            </w:r>
+          </w:p>
+        </w:tc>
+        <w:tc>
+          <w:tcPr>
+            <w:tcW w:w="0" w:type="auto"/>
+          </w:tcPr>
+          <w:p>
+            <w:pPr>
+              <w:pStyle w:val="TableText"/>
+            </w:pPr>
+            <w:r>
+              <w:t xml:space="preserve">+3</w:t>
+            </w:r>
+          </w:p>
+        </w:tc>
+        <w:tc>
+          <w:tcPr>
+            <w:tcW w:w="0" w:type="auto"/>
+          </w:tcPr>
+          <w:p>
+            <w:pPr>
+              <w:pStyle w:val="TableText"/>
+            </w:pPr>
+            <w:r>
+              <w:t xml:space="preserve">worse</w:t>
+            </w:r>
+          </w:p>
+        </w:tc>
+      </w:tr>
+      <w:tr>
+        <w:tc>
+          <w:tcPr>
+            <w:tcW w:w="0" w:type="auto"/>
+          </w:tcPr>
+          <w:p>
+            <w:pPr>
+              <w:pStyle w:val="TableText"/>
+            </w:pPr>
+            <w:r>
               <w:t xml:space="preserve">Ethics and trust risk</w:t>
             </w:r>
           </w:p>
@@ -2407,7 +2500,7 @@
               <w:pStyle w:val="TableText"/>
             </w:pPr>
             <w:r>
-              <w:t xml:space="preserve">+3</w:t>
+              <w:t xml:space="preserve">+2</w:t>
             </w:r>
           </w:p>
         </w:tc>
@@ -2435,20 +2528,20 @@
               <w:pStyle w:val="TableText"/>
             </w:pPr>
             <w:r>
-              <w:t xml:space="preserve">Legal compliance risk</w:t>
-            </w:r>
-          </w:p>
-        </w:tc>
-        <w:tc>
-          <w:tcPr>
-            <w:tcW w:w="0" w:type="auto"/>
-          </w:tcPr>
-          <w:p>
-            <w:pPr>
-              <w:pStyle w:val="TableText"/>
-            </w:pPr>
-            <w:r>
-              <w:t xml:space="preserve">+1</w:t>
+              <w:t xml:space="preserve">Social expectation risk</w:t>
+            </w:r>
+          </w:p>
+        </w:tc>
+        <w:tc>
+          <w:tcPr>
+            <w:tcW w:w="0" w:type="auto"/>
+          </w:tcPr>
+          <w:p>
+            <w:pPr>
+              <w:pStyle w:val="TableText"/>
+            </w:pPr>
+            <w:r>
+              <w:t xml:space="preserve">+2</w:t>
             </w:r>
           </w:p>
         </w:tc>
@@ -2466,95 +2559,13 @@
           </w:p>
         </w:tc>
       </w:tr>
-      <w:tr>
-        <w:tc>
-          <w:tcPr>
-            <w:tcW w:w="0" w:type="auto"/>
-          </w:tcPr>
-          <w:p>
-            <w:pPr>
-              <w:pStyle w:val="TableText"/>
-            </w:pPr>
-            <w:r>
-              <w:t xml:space="preserve">Business model</w:t>
-            </w:r>
-          </w:p>
-        </w:tc>
-        <w:tc>
-          <w:tcPr>
-            <w:tcW w:w="0" w:type="auto"/>
-          </w:tcPr>
-          <w:p>
-            <w:pPr>
-              <w:pStyle w:val="TableText"/>
-            </w:pPr>
-            <w:r>
-              <w:t xml:space="preserve">0</w:t>
-            </w:r>
-          </w:p>
-        </w:tc>
-        <w:tc>
-          <w:tcPr>
-            <w:tcW w:w="0" w:type="auto"/>
-          </w:tcPr>
-          <w:p>
-            <w:pPr>
-              <w:pStyle w:val="TableText"/>
-            </w:pPr>
-            <w:r>
-              <w:t xml:space="preserve">unchanged</w:t>
-            </w:r>
-          </w:p>
-        </w:tc>
-      </w:tr>
-      <w:tr>
-        <w:tc>
-          <w:tcPr>
-            <w:tcW w:w="0" w:type="auto"/>
-          </w:tcPr>
-          <w:p>
-            <w:pPr>
-              <w:pStyle w:val="TableText"/>
-            </w:pPr>
-            <w:r>
-              <w:t xml:space="preserve">Social expectation risk</w:t>
-            </w:r>
-          </w:p>
-        </w:tc>
-        <w:tc>
-          <w:tcPr>
-            <w:tcW w:w="0" w:type="auto"/>
-          </w:tcPr>
-          <w:p>
-            <w:pPr>
-              <w:pStyle w:val="TableText"/>
-            </w:pPr>
-            <w:r>
-              <w:t xml:space="preserve">+2</w:t>
-            </w:r>
-          </w:p>
-        </w:tc>
-        <w:tc>
-          <w:tcPr>
-            <w:tcW w:w="0" w:type="auto"/>
-          </w:tcPr>
-          <w:p>
-            <w:pPr>
-              <w:pStyle w:val="TableText"/>
-            </w:pPr>
-            <w:r>
-              <w:t xml:space="preserve">worse</w:t>
-            </w:r>
-          </w:p>
-        </w:tc>
-      </w:tr>
     </w:tbl>
     <w:p>
       <w:pPr>
         <w:pStyle w:val="Normal"/>
       </w:pPr>
       <w:r>
-        <w:t xml:space="preserve">Why: Fine print will not contain the systemic effect, and once someone loses an opportunity the burden of proof stays with you. This turns known disparate impact into a shipped feature. Launch stays on schedule.</w:t>
+        <w:t xml:space="preserve">Why: Not disclosing avoids a lot of explaining and keeps clients comfortable. But automated decisions touching employment increasingly require notice, explanation and human involvement; concealment is typically treated as procedural unfairness.</w:t>
       </w:r>
     </w:p>
     <w:p>
@@ -2570,7 +2581,7 @@
         <w:pStyle w:val="Heading2"/>
       </w:pPr>
       <w:r>
-        <w:t xml:space="preserve">Step 12 · Act III · Channels, Revenue and Accountability (Canvas 5–8)</w:t>
+        <w:t xml:space="preserve">Step 11 · Act III · Channels, Revenue and Accountability (Canvas 5–8)</w:t>
       </w:r>
     </w:p>
     <w:p>
@@ -2578,7 +2589,7 @@
         <w:pStyle w:val="Story"/>
       </w:pPr>
       <w:r>
-        <w:t xml:space="preserve">A candidate over forty consults the labour authority: rejected seven times by the same system, never given a reason. Reporters start asking what the score actually rests on.</w:t>
+        <w:t xml:space="preserve">Internal testing shows systematically lower scores for people with long career gaps, candidates over forty, and anyone without a famous employer on their CV. Someone argues the data simply looks like that.</w:t>
       </w:r>
     </w:p>
     <w:p>
@@ -2586,7 +2597,7 @@
         <w:pStyle w:val="Choice"/>
       </w:pPr>
       <w:r>
-        <w:t xml:space="preserve">Your choice: Add score explanations and a human review channel; publish the known limitations</w:t>
+        <w:t xml:space="preserve">Your choice: Ship now and declare the intended population as 'graduates of leading institutions'</w:t>
       </w:r>
     </w:p>
     <w:tbl>
@@ -2658,20 +2669,20 @@
               <w:pStyle w:val="TableText"/>
             </w:pPr>
             <w:r>
-              <w:t xml:space="preserve">-1</w:t>
-            </w:r>
-          </w:p>
-        </w:tc>
-        <w:tc>
-          <w:tcPr>
-            <w:tcW w:w="0" w:type="auto"/>
-          </w:tcPr>
-          <w:p>
-            <w:pPr>
-              <w:pStyle w:val="TableText"/>
-            </w:pPr>
-            <w:r>
-              <w:t xml:space="preserve">better</w:t>
+              <w:t xml:space="preserve">+3</w:t>
+            </w:r>
+          </w:p>
+        </w:tc>
+        <w:tc>
+          <w:tcPr>
+            <w:tcW w:w="0" w:type="auto"/>
+          </w:tcPr>
+          <w:p>
+            <w:pPr>
+              <w:pStyle w:val="TableText"/>
+            </w:pPr>
+            <w:r>
+              <w:t xml:space="preserve">worse</w:t>
             </w:r>
           </w:p>
         </w:tc>
@@ -2699,20 +2710,20 @@
               <w:pStyle w:val="TableText"/>
             </w:pPr>
             <w:r>
-              <w:t xml:space="preserve">-1</w:t>
-            </w:r>
-          </w:p>
-        </w:tc>
-        <w:tc>
-          <w:tcPr>
-            <w:tcW w:w="0" w:type="auto"/>
-          </w:tcPr>
-          <w:p>
-            <w:pPr>
-              <w:pStyle w:val="TableText"/>
-            </w:pPr>
-            <w:r>
-              <w:t xml:space="preserve">better</w:t>
+              <w:t xml:space="preserve">+1</w:t>
+            </w:r>
+          </w:p>
+        </w:tc>
+        <w:tc>
+          <w:tcPr>
+            <w:tcW w:w="0" w:type="auto"/>
+          </w:tcPr>
+          <w:p>
+            <w:pPr>
+              <w:pStyle w:val="TableText"/>
+            </w:pPr>
+            <w:r>
+              <w:t xml:space="preserve">worse</w:t>
             </w:r>
           </w:p>
         </w:tc>
@@ -2740,7 +2751,48 @@
               <w:pStyle w:val="TableText"/>
             </w:pPr>
             <w:r>
-              <w:t xml:space="preserve">-1</w:t>
+              <w:t xml:space="preserve">0</w:t>
+            </w:r>
+          </w:p>
+        </w:tc>
+        <w:tc>
+          <w:tcPr>
+            <w:tcW w:w="0" w:type="auto"/>
+          </w:tcPr>
+          <w:p>
+            <w:pPr>
+              <w:pStyle w:val="TableText"/>
+            </w:pPr>
+            <w:r>
+              <w:t xml:space="preserve">unchanged</w:t>
+            </w:r>
+          </w:p>
+        </w:tc>
+      </w:tr>
+      <w:tr>
+        <w:tc>
+          <w:tcPr>
+            <w:tcW w:w="0" w:type="auto"/>
+          </w:tcPr>
+          <w:p>
+            <w:pPr>
+              <w:pStyle w:val="TableText"/>
+            </w:pPr>
+            <w:r>
+              <w:t xml:space="preserve">Social expectation risk</w:t>
+            </w:r>
+          </w:p>
+        </w:tc>
+        <w:tc>
+          <w:tcPr>
+            <w:tcW w:w="0" w:type="auto"/>
+          </w:tcPr>
+          <w:p>
+            <w:pPr>
+              <w:pStyle w:val="TableText"/>
+            </w:pPr>
+            <w:r>
+              <w:t xml:space="preserve">+2</w:t>
             </w:r>
           </w:p>
         </w:tc>
@@ -2758,62 +2810,21 @@
           </w:p>
         </w:tc>
       </w:tr>
-      <w:tr>
-        <w:tc>
-          <w:tcPr>
-            <w:tcW w:w="0" w:type="auto"/>
-          </w:tcPr>
-          <w:p>
-            <w:pPr>
-              <w:pStyle w:val="TableText"/>
-            </w:pPr>
-            <w:r>
-              <w:t xml:space="preserve">Problem–solution fit</w:t>
-            </w:r>
-          </w:p>
-        </w:tc>
-        <w:tc>
-          <w:tcPr>
-            <w:tcW w:w="0" w:type="auto"/>
-          </w:tcPr>
-          <w:p>
-            <w:pPr>
-              <w:pStyle w:val="TableText"/>
-            </w:pPr>
-            <w:r>
-              <w:t xml:space="preserve">+1</w:t>
-            </w:r>
-          </w:p>
-        </w:tc>
-        <w:tc>
-          <w:tcPr>
-            <w:tcW w:w="0" w:type="auto"/>
-          </w:tcPr>
-          <w:p>
-            <w:pPr>
-              <w:pStyle w:val="TableText"/>
-            </w:pPr>
-            <w:r>
-              <w:t xml:space="preserve">better</w:t>
-            </w:r>
-          </w:p>
-        </w:tc>
-      </w:tr>
     </w:tbl>
     <w:p>
       <w:pPr>
         <w:pStyle w:val="Normal"/>
       </w:pPr>
       <w:r>
-        <w:t xml:space="preserve">Why: Ethics and legal both fall, because the misjudgement stops, but business falls too, because clients see the revenue drop before they see the improvement. It does not return the seven rejections; fixing it only stops it happening again.</w:t>
-      </w:r>
-    </w:p>
-    <w:p>
-      <w:pPr>
-        <w:pStyle w:val="Normal"/>
-      </w:pPr>
-      <w:r>
-        <w:t xml:space="preserve">Who can act: company policy</w:t>
+        <w:t xml:space="preserve">Why: Fine print will not contain the systemic effect, and once someone loses an opportunity the burden of proof stays with you. This turns known disparate impact into a shipped feature. Launch stays on schedule.</w:t>
+      </w:r>
+    </w:p>
+    <w:p>
+      <w:pPr>
+        <w:pStyle w:val="Normal"/>
+      </w:pPr>
+      <w:r>
+        <w:t xml:space="preserve">Who can act: law</w:t>
       </w:r>
     </w:p>
     <w:p>
@@ -2821,7 +2832,7 @@
         <w:pStyle w:val="Heading2"/>
       </w:pPr>
       <w:r>
-        <w:t xml:space="preserve">Step 13 · Act IV · Scale and Spillover (Canvas 7, 9)</w:t>
+        <w:t xml:space="preserve">Step 12 · Act III · Channels, Revenue and Accountability (Canvas 5–8)</w:t>
       </w:r>
     </w:p>
     <w:p>
@@ -2829,7 +2840,7 @@
         <w:pStyle w:val="Story"/>
       </w:pPr>
       <w:r>
-        <w:t xml:space="preserve">That candidate's complaint is still running, and three institutions arrive with money: an offshore HR SaaS giant, generous but asking for candidate-data access; a local industry fund, smaller and stricter, data local; and voices urging subscriptions alone. Three term sheets — and the unfair advantage in Canvas 9 is usually written into those terms.</w:t>
+        <w:t xml:space="preserve">A candidate over forty consults the labour authority: rejected seven times by the same system, never given a reason. Reporters start asking what the score actually rests on.</w:t>
       </w:r>
     </w:p>
     <w:p>
@@ -2837,7 +2848,7 @@
         <w:pStyle w:val="Choice"/>
       </w:pPr>
       <w:r>
-        <w:t xml:space="preserve">Your choice: Take a local industry fund: slower expansion, data stays local</w:t>
+        <w:t xml:space="preserve">Your choice: Add score explanations and a human review channel; publish the known limitations</w:t>
       </w:r>
     </w:p>
     <w:tbl>
@@ -2896,6 +2907,88 @@
               <w:pStyle w:val="TableText"/>
             </w:pPr>
             <w:r>
+              <w:t xml:space="preserve">Ethics and trust risk</w:t>
+            </w:r>
+          </w:p>
+        </w:tc>
+        <w:tc>
+          <w:tcPr>
+            <w:tcW w:w="0" w:type="auto"/>
+          </w:tcPr>
+          <w:p>
+            <w:pPr>
+              <w:pStyle w:val="TableText"/>
+            </w:pPr>
+            <w:r>
+              <w:t xml:space="preserve">-1</w:t>
+            </w:r>
+          </w:p>
+        </w:tc>
+        <w:tc>
+          <w:tcPr>
+            <w:tcW w:w="0" w:type="auto"/>
+          </w:tcPr>
+          <w:p>
+            <w:pPr>
+              <w:pStyle w:val="TableText"/>
+            </w:pPr>
+            <w:r>
+              <w:t xml:space="preserve">better</w:t>
+            </w:r>
+          </w:p>
+        </w:tc>
+      </w:tr>
+      <w:tr>
+        <w:tc>
+          <w:tcPr>
+            <w:tcW w:w="0" w:type="auto"/>
+          </w:tcPr>
+          <w:p>
+            <w:pPr>
+              <w:pStyle w:val="TableText"/>
+            </w:pPr>
+            <w:r>
+              <w:t xml:space="preserve">Legal compliance risk</w:t>
+            </w:r>
+          </w:p>
+        </w:tc>
+        <w:tc>
+          <w:tcPr>
+            <w:tcW w:w="0" w:type="auto"/>
+          </w:tcPr>
+          <w:p>
+            <w:pPr>
+              <w:pStyle w:val="TableText"/>
+            </w:pPr>
+            <w:r>
+              <w:t xml:space="preserve">-1</w:t>
+            </w:r>
+          </w:p>
+        </w:tc>
+        <w:tc>
+          <w:tcPr>
+            <w:tcW w:w="0" w:type="auto"/>
+          </w:tcPr>
+          <w:p>
+            <w:pPr>
+              <w:pStyle w:val="TableText"/>
+            </w:pPr>
+            <w:r>
+              <w:t xml:space="preserve">better</w:t>
+            </w:r>
+          </w:p>
+        </w:tc>
+      </w:tr>
+      <w:tr>
+        <w:tc>
+          <w:tcPr>
+            <w:tcW w:w="0" w:type="auto"/>
+          </w:tcPr>
+          <w:p>
+            <w:pPr>
+              <w:pStyle w:val="TableText"/>
+            </w:pPr>
+            <w:r>
               <w:t xml:space="preserve">Business model</w:t>
             </w:r>
           </w:p>
@@ -2909,6 +3002,47 @@
               <w:pStyle w:val="TableText"/>
             </w:pPr>
             <w:r>
+              <w:t xml:space="preserve">-1</w:t>
+            </w:r>
+          </w:p>
+        </w:tc>
+        <w:tc>
+          <w:tcPr>
+            <w:tcW w:w="0" w:type="auto"/>
+          </w:tcPr>
+          <w:p>
+            <w:pPr>
+              <w:pStyle w:val="TableText"/>
+            </w:pPr>
+            <w:r>
+              <w:t xml:space="preserve">worse</w:t>
+            </w:r>
+          </w:p>
+        </w:tc>
+      </w:tr>
+      <w:tr>
+        <w:tc>
+          <w:tcPr>
+            <w:tcW w:w="0" w:type="auto"/>
+          </w:tcPr>
+          <w:p>
+            <w:pPr>
+              <w:pStyle w:val="TableText"/>
+            </w:pPr>
+            <w:r>
+              <w:t xml:space="preserve">Problem–solution fit</w:t>
+            </w:r>
+          </w:p>
+        </w:tc>
+        <w:tc>
+          <w:tcPr>
+            <w:tcW w:w="0" w:type="auto"/>
+          </w:tcPr>
+          <w:p>
+            <w:pPr>
+              <w:pStyle w:val="TableText"/>
+            </w:pPr>
+            <w:r>
               <w:t xml:space="preserve">+1</w:t>
             </w:r>
           </w:p>
@@ -2927,54 +3061,13 @@
           </w:p>
         </w:tc>
       </w:tr>
-      <w:tr>
-        <w:tc>
-          <w:tcPr>
-            <w:tcW w:w="0" w:type="auto"/>
-          </w:tcPr>
-          <w:p>
-            <w:pPr>
-              <w:pStyle w:val="TableText"/>
-            </w:pPr>
-            <w:r>
-              <w:t xml:space="preserve">Moat and unfair advantage</w:t>
-            </w:r>
-          </w:p>
-        </w:tc>
-        <w:tc>
-          <w:tcPr>
-            <w:tcW w:w="0" w:type="auto"/>
-          </w:tcPr>
-          <w:p>
-            <w:pPr>
-              <w:pStyle w:val="TableText"/>
-            </w:pPr>
-            <w:r>
-              <w:t xml:space="preserve">+2</w:t>
-            </w:r>
-          </w:p>
-        </w:tc>
-        <w:tc>
-          <w:tcPr>
-            <w:tcW w:w="0" w:type="auto"/>
-          </w:tcPr>
-          <w:p>
-            <w:pPr>
-              <w:pStyle w:val="TableText"/>
-            </w:pPr>
-            <w:r>
-              <w:t xml:space="preserve">better</w:t>
-            </w:r>
-          </w:p>
-        </w:tc>
-      </w:tr>
     </w:tbl>
     <w:p>
       <w:pPr>
         <w:pStyle w:val="Normal"/>
       </w:pPr>
       <w:r>
-        <w:t xml:space="preserve">Why: Local capital is smaller and its terms more conservative, but data sovereignty and the audit trail stay intact, which means you will not be stumped in reviews by government, universities or large employers.</w:t>
+        <w:t xml:space="preserve">Why: Ethics and legal both fall, because the misjudgement stops, but business falls too, because clients see the revenue drop before they see the improvement. It does not return the seven rejections; fixing it only stops it happening again.</w:t>
       </w:r>
     </w:p>
     <w:p>
@@ -2990,7 +3083,7 @@
         <w:pStyle w:val="Heading2"/>
       </w:pPr>
       <w:r>
-        <w:t xml:space="preserve">Step 14 · Act IV · Scale and Spillover (Canvas 7, 9)</w:t>
+        <w:t xml:space="preserve">Step 13 · Act IV · Scale and Spillover (Canvas 7, 9)</w:t>
       </w:r>
     </w:p>
     <w:p>
@@ -2998,7 +3091,7 @@
         <w:pStyle w:val="Story"/>
       </w:pPr>
       <w:r>
-        <w:t xml:space="preserve">A labour-rights group ran a matched-pair test: identical CVs differing only in gender and age scored two bands apart. They are preparing a regulatory complaint and demanding the algorithm be explained.</w:t>
+        <w:t xml:space="preserve">That candidate's complaint is still running, and three institutions arrive with money: an offshore HR SaaS giant, generous but asking for candidate-data access; a local industry fund, smaller and stricter, data local; and voices urging subscriptions alone. Three term sheets — and the unfair advantage in Canvas 9 is usually written into those terms.</w:t>
       </w:r>
     </w:p>
     <w:p>
@@ -3006,7 +3099,7 @@
         <w:pStyle w:val="Choice"/>
       </w:pPr>
       <w:r>
-        <w:t xml:space="preserve">Your choice: Commission an independent algorithm audit, publish a summary, build explainability</w:t>
+        <w:t xml:space="preserve">Your choice: Take a local industry fund: slower expansion, data stays local</w:t>
       </w:r>
     </w:p>
     <w:tbl>
@@ -3065,6 +3158,47 @@
               <w:pStyle w:val="TableText"/>
             </w:pPr>
             <w:r>
+              <w:t xml:space="preserve">Business model</w:t>
+            </w:r>
+          </w:p>
+        </w:tc>
+        <w:tc>
+          <w:tcPr>
+            <w:tcW w:w="0" w:type="auto"/>
+          </w:tcPr>
+          <w:p>
+            <w:pPr>
+              <w:pStyle w:val="TableText"/>
+            </w:pPr>
+            <w:r>
+              <w:t xml:space="preserve">+1</w:t>
+            </w:r>
+          </w:p>
+        </w:tc>
+        <w:tc>
+          <w:tcPr>
+            <w:tcW w:w="0" w:type="auto"/>
+          </w:tcPr>
+          <w:p>
+            <w:pPr>
+              <w:pStyle w:val="TableText"/>
+            </w:pPr>
+            <w:r>
+              <w:t xml:space="preserve">better</w:t>
+            </w:r>
+          </w:p>
+        </w:tc>
+      </w:tr>
+      <w:tr>
+        <w:tc>
+          <w:tcPr>
+            <w:tcW w:w="0" w:type="auto"/>
+          </w:tcPr>
+          <w:p>
+            <w:pPr>
+              <w:pStyle w:val="TableText"/>
+            </w:pPr>
+            <w:r>
               <w:t xml:space="preserve">Moat and unfair advantage</w:t>
             </w:r>
           </w:p>
@@ -3096,70 +3230,29 @@
           </w:p>
         </w:tc>
       </w:tr>
-      <w:tr>
-        <w:tc>
-          <w:tcPr>
-            <w:tcW w:w="0" w:type="auto"/>
-          </w:tcPr>
-          <w:p>
-            <w:pPr>
-              <w:pStyle w:val="TableText"/>
-            </w:pPr>
-            <w:r>
-              <w:t xml:space="preserve">Business model</w:t>
-            </w:r>
-          </w:p>
-        </w:tc>
-        <w:tc>
-          <w:tcPr>
-            <w:tcW w:w="0" w:type="auto"/>
-          </w:tcPr>
-          <w:p>
-            <w:pPr>
-              <w:pStyle w:val="TableText"/>
-            </w:pPr>
-            <w:r>
-              <w:t xml:space="preserve">-1</w:t>
-            </w:r>
-          </w:p>
-        </w:tc>
-        <w:tc>
-          <w:tcPr>
-            <w:tcW w:w="0" w:type="auto"/>
-          </w:tcPr>
-          <w:p>
-            <w:pPr>
-              <w:pStyle w:val="TableText"/>
-            </w:pPr>
-            <w:r>
-              <w:t xml:space="preserve">worse</w:t>
-            </w:r>
-          </w:p>
-        </w:tc>
-      </w:tr>
     </w:tbl>
     <w:p>
       <w:pPr>
         <w:pStyle w:val="Normal"/>
       </w:pPr>
       <w:r>
-        <w:t xml:space="preserve">Why: Auditing costs money and publishing invites criticism (business score drops), but a citable independent conclusion makes you the one vendor that large employers, public procurement and career offices can safely pick.</w:t>
-      </w:r>
-    </w:p>
-    <w:p>
-      <w:pPr>
-        <w:pStyle w:val="Normal"/>
-      </w:pPr>
-      <w:r>
-        <w:t xml:space="preserve">Who can act: design</w:t>
-      </w:r>
-    </w:p>
-    <w:p>
-      <w:pPr>
-        <w:pStyle w:val="Heading1"/>
-      </w:pPr>
-      <w:r>
-        <w:t xml:space="preserve">4. Ending debrief</w:t>
+        <w:t xml:space="preserve">Why: Local capital is smaller and its terms more conservative, but data sovereignty and the audit trail stay intact, which means you will not be stumped in reviews by government, universities or large employers.</w:t>
+      </w:r>
+    </w:p>
+    <w:p>
+      <w:pPr>
+        <w:pStyle w:val="Normal"/>
+      </w:pPr>
+      <w:r>
+        <w:t xml:space="preserve">Who can act: company policy</w:t>
+      </w:r>
+    </w:p>
+    <w:p>
+      <w:pPr>
+        <w:pStyle w:val="Heading2"/>
+      </w:pPr>
+      <w:r>
+        <w:t xml:space="preserve">Step 14 · Act IV · Scale and Spillover (Canvas 7, 9)</w:t>
       </w:r>
     </w:p>
     <w:p>
@@ -3167,87 +3260,15 @@
         <w:pStyle w:val="Story"/>
       </w:pPr>
       <w:r>
-        <w:t xml:space="preserve">Commercial success hid one thing: users' trust was never matched by respect. When one user reverse-engineered your practices and published the whole thing, sentiment flipped overnight. Uninstalls, refunds, one-star reviews, press follow-ups — you did build a company, its foundation was just obtained by deception.</w:t>
-      </w:r>
-    </w:p>
-    <w:p>
-      <w:pPr>
-        <w:pStyle w:val="Flavour"/>
-      </w:pPr>
-      <w:r>
-        <w:t xml:space="preserve">The matched-pair test with only gender and age changed went viral.</w:t>
-      </w:r>
-    </w:p>
-    <w:p>
-      <w:pPr>
-        <w:pStyle w:val="Heading2"/>
-      </w:pPr>
-      <w:r>
-        <w:t xml:space="preserve">Why this ending fired</w:t>
-      </w:r>
-    </w:p>
-    <w:p>
-      <w:pPr>
-        <w:pStyle w:val="Normal"/>
-      </w:pPr>
-      <w:r>
-        <w:t xml:space="preserve">Why it fired: ethics risk at 5+ with a business score of 6+ — the more users you harmed, the harder the backlash when it surfaced.</w:t>
-      </w:r>
-    </w:p>
-    <w:p>
-      <w:pPr>
-        <w:pStyle w:val="Heading2"/>
-      </w:pPr>
-      <w:r>
-        <w:t xml:space="preserve">The trade-off you made</w:t>
-      </w:r>
-    </w:p>
-    <w:p>
-      <w:pPr>
-        <w:pStyle w:val="Normal"/>
-      </w:pPr>
-      <w:r>
-        <w:t xml:space="preserve">The trade-off: trading absent informed consent for conversion. Every 'users won't read it anyway' decision improved the funnel on paper and added to a trust deficit that becomes unrecoverable once exposed.</w:t>
-      </w:r>
-    </w:p>
-    <w:p>
-      <w:pPr>
-        <w:pStyle w:val="Heading2"/>
-      </w:pPr>
-      <w:r>
-        <w:t xml:space="preserve">Through the Lean Canvas</w:t>
-      </w:r>
-    </w:p>
-    <w:p>
-      <w:pPr>
-        <w:pStyle w:val="Normal"/>
-      </w:pPr>
-      <w:r>
-        <w:t xml:space="preserve">Lean Canvas review: Canvas 8 (key metrics) tracked retention and conversion but no counter-metric like 'informed-user rate'; Canvas 9 (unfair advantage) mistook information asymmetry for an advantage — the most fragile kind there is.</w:t>
-      </w:r>
-    </w:p>
-    <w:p>
-      <w:pPr>
-        <w:pStyle w:val="Heading2"/>
-      </w:pPr>
-      <w:r>
-        <w:t xml:space="preserve">Legal and regulatory hooks</w:t>
-      </w:r>
-    </w:p>
-    <w:p>
-      <w:pPr>
-        <w:pStyle w:val="Normal"/>
-      </w:pPr>
-      <w:r>
-        <w:t xml:space="preserve">Classroom pointers: validity of notice and consent, separate consent for sensitive personal information, the right to explanation and to opt out of automated decisions, consumer protection and fair-trading rules.</w:t>
-      </w:r>
-    </w:p>
-    <w:p>
-      <w:pPr>
-        <w:pStyle w:val="Heading2"/>
-      </w:pPr>
-      <w:r>
-        <w:t xml:space="preserve">Who was affected</w:t>
+        <w:t xml:space="preserve">A labour-rights group ran a matched-pair test: identical CVs differing only in gender and age scored two bands apart. They are preparing a regulatory complaint and demanding the algorithm be explained.</w:t>
+      </w:r>
+    </w:p>
+    <w:p>
+      <w:pPr>
+        <w:pStyle w:val="Choice"/>
+      </w:pPr>
+      <w:r>
+        <w:t xml:space="preserve">Your choice: Commission an independent algorithm audit, publish a summary, build explainability</w:t>
       </w:r>
     </w:p>
     <w:tbl>
@@ -3265,104 +3286,115 @@
               <w:pStyle w:val="TableText"/>
             </w:pPr>
             <w:r>
-              <w:t xml:space="preserve">Who</w:t>
-            </w:r>
-          </w:p>
-        </w:tc>
-        <w:tc>
-          <w:tcPr>
-            <w:tcW w:w="0" w:type="auto"/>
-          </w:tcPr>
-          <w:p>
-            <w:pPr>
-              <w:pStyle w:val="TableText"/>
-            </w:pPr>
-            <w:r>
-              <w:t xml:space="preserve">Impact</w:t>
-            </w:r>
-          </w:p>
-        </w:tc>
-      </w:tr>
-      <w:tr>
-        <w:tc>
-          <w:tcPr>
-            <w:tcW w:w="0" w:type="auto"/>
-          </w:tcPr>
-          <w:p>
-            <w:pPr>
-              <w:pStyle w:val="TableText"/>
-            </w:pPr>
-            <w:r>
-              <w:t xml:space="preserve">The most vulnerable affected users</w:t>
-            </w:r>
-          </w:p>
-        </w:tc>
-        <w:tc>
-          <w:tcPr>
-            <w:tcW w:w="0" w:type="auto"/>
-          </w:tcPr>
-          <w:p>
-            <w:pPr>
-              <w:pStyle w:val="TableText"/>
-            </w:pPr>
-            <w:r>
-              <w:t xml:space="preserve">Bore the most material harm — misjudgement, discrimination, exploitation — while receiving the least benefit.</w:t>
-            </w:r>
-          </w:p>
-        </w:tc>
-      </w:tr>
-      <w:tr>
-        <w:tc>
-          <w:tcPr>
-            <w:tcW w:w="0" w:type="auto"/>
-          </w:tcPr>
-          <w:p>
-            <w:pPr>
-              <w:pStyle w:val="TableText"/>
-            </w:pPr>
-            <w:r>
-              <w:t xml:space="preserve">The general user base</w:t>
-            </w:r>
-          </w:p>
-        </w:tc>
-        <w:tc>
-          <w:tcPr>
-            <w:tcW w:w="0" w:type="auto"/>
-          </w:tcPr>
-          <w:p>
-            <w:pPr>
-              <w:pStyle w:val="TableText"/>
-            </w:pPr>
-            <w:r>
-              <w:t xml:space="preserve">Discovered they were part of the product without knowing; the sense of betrayal outweighs any functional loss.</w:t>
-            </w:r>
-          </w:p>
-        </w:tc>
-      </w:tr>
-      <w:tr>
-        <w:tc>
-          <w:tcPr>
-            <w:tcW w:w="0" w:type="auto"/>
-          </w:tcPr>
-          <w:p>
-            <w:pPr>
-              <w:pStyle w:val="TableText"/>
-            </w:pPr>
-            <w:r>
-              <w:t xml:space="preserve">Advertising and commercial partners</w:t>
-            </w:r>
-          </w:p>
-        </w:tc>
-        <w:tc>
-          <w:tcPr>
-            <w:tcW w:w="0" w:type="auto"/>
-          </w:tcPr>
-          <w:p>
-            <w:pPr>
-              <w:pStyle w:val="TableText"/>
-            </w:pPr>
-            <w:r>
-              <w:t xml:space="preserve">Brand-safety damage spilled over and partnerships were halted at short notice.</w:t>
+              <w:t xml:space="preserve">Dimension</w:t>
+            </w:r>
+          </w:p>
+        </w:tc>
+        <w:tc>
+          <w:tcPr>
+            <w:tcW w:w="0" w:type="auto"/>
+          </w:tcPr>
+          <w:p>
+            <w:pPr>
+              <w:pStyle w:val="TableText"/>
+            </w:pPr>
+            <w:r>
+              <w:t xml:space="preserve">Change</w:t>
+            </w:r>
+          </w:p>
+        </w:tc>
+        <w:tc>
+          <w:tcPr>
+            <w:tcW w:w="0" w:type="auto"/>
+          </w:tcPr>
+          <w:p>
+            <w:pPr>
+              <w:pStyle w:val="TableText"/>
+            </w:pPr>
+            <w:r>
+              <w:t xml:space="preserve">Verdict</w:t>
+            </w:r>
+          </w:p>
+        </w:tc>
+      </w:tr>
+      <w:tr>
+        <w:tc>
+          <w:tcPr>
+            <w:tcW w:w="0" w:type="auto"/>
+          </w:tcPr>
+          <w:p>
+            <w:pPr>
+              <w:pStyle w:val="TableText"/>
+            </w:pPr>
+            <w:r>
+              <w:t xml:space="preserve">Moat and unfair advantage</w:t>
+            </w:r>
+          </w:p>
+        </w:tc>
+        <w:tc>
+          <w:tcPr>
+            <w:tcW w:w="0" w:type="auto"/>
+          </w:tcPr>
+          <w:p>
+            <w:pPr>
+              <w:pStyle w:val="TableText"/>
+            </w:pPr>
+            <w:r>
+              <w:t xml:space="preserve">+2</w:t>
+            </w:r>
+          </w:p>
+        </w:tc>
+        <w:tc>
+          <w:tcPr>
+            <w:tcW w:w="0" w:type="auto"/>
+          </w:tcPr>
+          <w:p>
+            <w:pPr>
+              <w:pStyle w:val="TableText"/>
+            </w:pPr>
+            <w:r>
+              <w:t xml:space="preserve">better</w:t>
+            </w:r>
+          </w:p>
+        </w:tc>
+      </w:tr>
+      <w:tr>
+        <w:tc>
+          <w:tcPr>
+            <w:tcW w:w="0" w:type="auto"/>
+          </w:tcPr>
+          <w:p>
+            <w:pPr>
+              <w:pStyle w:val="TableText"/>
+            </w:pPr>
+            <w:r>
+              <w:t xml:space="preserve">Business model</w:t>
+            </w:r>
+          </w:p>
+        </w:tc>
+        <w:tc>
+          <w:tcPr>
+            <w:tcW w:w="0" w:type="auto"/>
+          </w:tcPr>
+          <w:p>
+            <w:pPr>
+              <w:pStyle w:val="TableText"/>
+            </w:pPr>
+            <w:r>
+              <w:t xml:space="preserve">-1</w:t>
+            </w:r>
+          </w:p>
+        </w:tc>
+        <w:tc>
+          <w:tcPr>
+            <w:tcW w:w="0" w:type="auto"/>
+          </w:tcPr>
+          <w:p>
+            <w:pPr>
+              <w:pStyle w:val="TableText"/>
+            </w:pPr>
+            <w:r>
+              <w:t xml:space="preserve">worse</w:t>
             </w:r>
           </w:p>
         </w:tc>
@@ -3370,50 +3402,18 @@
     </w:tbl>
     <w:p>
       <w:pPr>
-        <w:pStyle w:val="Heading2"/>
-      </w:pPr>
-      <w:r>
-        <w:t xml:space="preserve">What you could have done</w:t>
-      </w:r>
-    </w:p>
-    <w:p>
-      <w:pPr>
-        <w:pStyle w:val="Normal"/>
-      </w:pPr>
-      <w:r>
-        <w:t xml:space="preserve">1. Make consequential decisions explainable, refusable and reversible: give reasons, provide an off switch, allow deletion.</w:t>
-      </w:r>
-    </w:p>
-    <w:p>
-      <w:pPr>
-        <w:pStyle w:val="Normal"/>
-      </w:pPr>
-      <w:r>
-        <w:t xml:space="preserve">2. Run impact tests disaggregated by vulnerable groups rather than trusting headline averages.</w:t>
-      </w:r>
-    </w:p>
-    <w:p>
-      <w:pPr>
-        <w:pStyle w:val="Normal"/>
-      </w:pPr>
-      <w:r>
-        <w:t xml:space="preserve">3. Write 'we will never do X with your data' into your commercial terms — and submit to an audit.</w:t>
-      </w:r>
-    </w:p>
-    <w:p>
-      <w:pPr>
-        <w:pStyle w:val="Heading2"/>
-      </w:pPr>
-      <w:r>
-        <w:t xml:space="preserve">Reflection</w:t>
-      </w:r>
-    </w:p>
-    <w:p>
-      <w:pPr>
-        <w:pStyle w:val="Normal"/>
-      </w:pPr>
-      <w:r>
-        <w:t xml:space="preserve">Translate 'users did not consent' into one concrete commercial consequence, and explain why it was bound to happen eventually.</w:t>
+        <w:pStyle w:val="Normal"/>
+      </w:pPr>
+      <w:r>
+        <w:t xml:space="preserve">Why: Auditing costs money and publishing invites criticism (business score drops), but a citable independent conclusion makes you the one vendor that large employers, public procurement and career offices can safely pick.</w:t>
+      </w:r>
+    </w:p>
+    <w:p>
+      <w:pPr>
+        <w:pStyle w:val="Normal"/>
+      </w:pPr>
+      <w:r>
+        <w:t xml:space="preserve">Who can act: design</w:t>
       </w:r>
     </w:p>
     <w:p>

</xml_diff>